<commit_message>
verify: run complete local Nexent skill QA
</commit_message>
<xml_diff>
--- a/项目文档/华为ICT赛道三_开发设计文档.docx
+++ b/项目文档/华为ICT赛道三_开发设计文档.docx
@@ -118,7 +118,7 @@
                 <w:rFonts w:ascii="Microsoft YaHei" w:hAnsi="Microsoft YaHei" w:eastAsia="Microsoft YaHei"/>
                 <w:sz w:val="18"/>
               </w:rPr>
-              <w:t>1.3（提交件底稿）</w:t>
+              <w:t>1.4（提交件底稿）</w:t>
             </w:r>
           </w:p>
         </w:tc>
@@ -183,7 +183,7 @@
                 <w:rFonts w:ascii="Microsoft YaHei" w:hAnsi="Microsoft YaHei" w:eastAsia="Microsoft YaHei"/>
                 <w:sz w:val="18"/>
               </w:rPr>
-              <w:t>2026-09-29</w:t>
+              <w:t>2026-09-30</w:t>
             </w:r>
           </w:p>
         </w:tc>
@@ -2995,6 +2995,15 @@
       </w:r>
     </w:p>
     <w:p>
+      <w:r>
+        <w:rPr>
+          <w:rFonts w:ascii="Microsoft YaHei" w:hAnsi="Microsoft YaHei" w:eastAsia="Microsoft YaHei"/>
+          <w:sz w:val="21"/>
+        </w:rPr>
+        <w:t>本节区分两个不同的模型位置，避免把平台侧验收写成后端已内置 LLM：</w:t>
+      </w:r>
+    </w:p>
+    <w:p>
       <w:pPr>
         <w:pStyle w:val="ListBullet"/>
         <w:ind w:left="346" w:hanging="259"/>
@@ -3002,9 +3011,17 @@
       <w:r>
         <w:rPr>
           <w:rFonts w:ascii="Microsoft YaHei" w:hAnsi="Microsoft YaHei" w:eastAsia="Microsoft YaHei"/>
+          <w:b/>
           <w:sz w:val="21"/>
         </w:rPr>
-        <w:t>当前规划器默认使用</w:t>
+        <w:t>SeaSight 后端内置规划器</w:t>
+      </w:r>
+      <w:r>
+        <w:rPr>
+          <w:rFonts w:ascii="Microsoft YaHei" w:hAnsi="Microsoft YaHei" w:eastAsia="Microsoft YaHei"/>
+          <w:sz w:val="21"/>
+        </w:rPr>
+        <w:t>：默认使用</w:t>
       </w:r>
       <w:r>
         <w:rPr>
@@ -3077,7 +3094,7 @@
           <w:rFonts w:ascii="Microsoft YaHei" w:hAnsi="Microsoft YaHei" w:eastAsia="Microsoft YaHei"/>
           <w:sz w:val="21"/>
         </w:rPr>
-        <w:t xml:space="preserve"> 已就绪， </w:t>
+        <w:t xml:space="preserve"> 已就绪。 截至 2026-09-30，后端内置 LLM 规划器</w:t>
       </w:r>
       <w:r>
         <w:rPr>
@@ -3085,14 +3102,79 @@
           <w:b/>
           <w:sz w:val="21"/>
         </w:rPr>
-        <w:t>尚未真实调用任何外部模型</w:t>
+        <w:t>尚未真实调用外部模型</w:t>
       </w:r>
       <w:r>
         <w:rPr>
           <w:rFonts w:ascii="Microsoft YaHei" w:hAnsi="Microsoft YaHei" w:eastAsia="Microsoft YaHei"/>
           <w:sz w:val="21"/>
         </w:rPr>
-        <w:t>。</w:t>
+        <w:t>，验收依赖 平台侧注入的模型。</w:t>
+      </w:r>
+    </w:p>
+    <w:p>
+      <w:pPr>
+        <w:pStyle w:val="ListBullet"/>
+        <w:ind w:left="346" w:hanging="259"/>
+      </w:pPr>
+      <w:r>
+        <w:rPr>
+          <w:rFonts w:ascii="Microsoft YaHei" w:hAnsi="Microsoft YaHei" w:eastAsia="Microsoft YaHei"/>
+          <w:b/>
+          <w:sz w:val="21"/>
+        </w:rPr>
+        <w:t>Nexent 平台侧 Agent 模型</w:t>
+      </w:r>
+      <w:r>
+        <w:rPr>
+          <w:rFonts w:ascii="Microsoft YaHei" w:hAnsi="Microsoft YaHei" w:eastAsia="Microsoft YaHei"/>
+          <w:sz w:val="21"/>
+        </w:rPr>
+        <w:t>：本地官方源码部署已验证 Agent</w:t>
+      </w:r>
+    </w:p>
+    <w:p>
+      <w:r>
+        <w:rPr>
+          <w:rFonts w:ascii="Consolas" w:hAnsi="Consolas" w:eastAsia="Microsoft YaHei"/>
+          <w:sz w:val="20"/>
+        </w:rPr>
+        <w:t>seasight_governance_decision_agent</w:t>
+      </w:r>
+      <w:r>
+        <w:rPr>
+          <w:rFonts w:ascii="Microsoft YaHei" w:hAnsi="Microsoft YaHei" w:eastAsia="Microsoft YaHei"/>
+          <w:sz w:val="21"/>
+        </w:rPr>
+        <w:t xml:space="preserve"> 配置 DeepSeek </w:t>
+      </w:r>
+      <w:r>
+        <w:rPr>
+          <w:rFonts w:ascii="Consolas" w:hAnsi="Consolas" w:eastAsia="Microsoft YaHei"/>
+          <w:sz w:val="20"/>
+        </w:rPr>
+        <w:t>deepseek-v4-pro</w:t>
+      </w:r>
+      <w:r>
+        <w:rPr>
+          <w:rFonts w:ascii="Microsoft YaHei" w:hAnsi="Microsoft YaHei" w:eastAsia="Microsoft YaHei"/>
+          <w:sz w:val="21"/>
+        </w:rPr>
+        <w:t xml:space="preserve">， 并完成一次真实 LLM 完整 Skill 问答（R-NX-09，2026-09-30）；华为 AgentArts 托管平台 Agent 配置 </w:t>
+      </w:r>
+      <w:r>
+        <w:rPr>
+          <w:rFonts w:ascii="Consolas" w:hAnsi="Consolas" w:eastAsia="Microsoft YaHei"/>
+          <w:sz w:val="20"/>
+        </w:rPr>
+        <w:t>deepseek-provider/deepseek-chat</w:t>
+      </w:r>
+      <w:r>
+        <w:rPr>
+          <w:rFonts w:ascii="Microsoft YaHei" w:hAnsi="Microsoft YaHei" w:eastAsia="Microsoft YaHei"/>
+          <w:sz w:val="21"/>
+        </w:rPr>
+        <w:t>（R-NX-06）， 托管平台内完整问答仍待私网 Target 打通（R-NX-07 blocked）。</w:t>
       </w:r>
     </w:p>
     <w:p>
@@ -4220,14 +4302,14 @@
           <w:rFonts w:ascii="Consolas" w:hAnsi="Consolas" w:eastAsia="Microsoft YaHei"/>
           <w:sz w:val="20"/>
         </w:rPr>
-        <w:t>seasight-governance-decision-agent</w:t>
+        <w:t>seasight_governance_decision_agent</w:t>
       </w:r>
       <w:r>
         <w:rPr>
           <w:rFonts w:ascii="Microsoft YaHei" w:hAnsi="Microsoft YaHei" w:eastAsia="Microsoft YaHei"/>
           <w:sz w:val="21"/>
         </w:rPr>
-        <w:t xml:space="preserve"> （发布版本 v2）通过 </w:t>
+        <w:t xml:space="preserve"> 通过 </w:t>
       </w:r>
       <w:r>
         <w:rPr>
@@ -4311,7 +4393,64 @@
           <w:rFonts w:ascii="Microsoft YaHei" w:hAnsi="Microsoft YaHei" w:eastAsia="Microsoft YaHei"/>
           <w:sz w:val="21"/>
         </w:rPr>
-        <w:t>）， 登记号 R-NX-04。该关系图为工具/Skill 编排关系，不包含模型问答链路； LLM 未配置，完整问答仍待模型端点接入后补验。</w:t>
+        <w:t xml:space="preserve">）， 登记号 R-NX-04（发布版本 v2，未配置 LLM）。2026-09-30 在同一本地 官方源码部署中把该 Agent 升到发布版本 4 </w:t>
+      </w:r>
+      <w:r>
+        <w:rPr>
+          <w:rFonts w:ascii="Consolas" w:hAnsi="Consolas" w:eastAsia="Microsoft YaHei"/>
+          <w:sz w:val="20"/>
+        </w:rPr>
+        <w:t>v0.2.0-seasight-governance-llm</w:t>
+      </w:r>
+      <w:r>
+        <w:rPr>
+          <w:rFonts w:ascii="Microsoft YaHei" w:hAnsi="Microsoft YaHei" w:eastAsia="Microsoft YaHei"/>
+          <w:sz w:val="21"/>
+        </w:rPr>
+        <w:t xml:space="preserve">，叠加 DeepSeek </w:t>
+      </w:r>
+      <w:r>
+        <w:rPr>
+          <w:rFonts w:ascii="Consolas" w:hAnsi="Consolas" w:eastAsia="Microsoft YaHei"/>
+          <w:sz w:val="20"/>
+        </w:rPr>
+        <w:t>deepseek-v4-pro</w:t>
+      </w:r>
+      <w:r>
+        <w:rPr>
+          <w:rFonts w:ascii="Microsoft YaHei" w:hAnsi="Microsoft YaHei" w:eastAsia="Microsoft YaHei"/>
+          <w:sz w:val="21"/>
+        </w:rPr>
+        <w:t xml:space="preserve"> 模型配置 并跑通完整问答（登记号 R-NX-09），该关系图由此从“工具/Skill 编排关系” 延伸为包含模型问答链路的端到端运行，证据见 </w:t>
+      </w:r>
+      <w:r>
+        <w:rPr>
+          <w:rFonts w:ascii="Consolas" w:hAnsi="Consolas" w:eastAsia="Microsoft YaHei"/>
+          <w:sz w:val="20"/>
+        </w:rPr>
+        <w:t>evidence/llm-qa-2026-09-30/</w:t>
+      </w:r>
+      <w:r>
+        <w:rPr>
+          <w:rFonts w:ascii="Microsoft YaHei" w:hAnsi="Microsoft YaHei" w:eastAsia="Microsoft YaHei"/>
+          <w:sz w:val="21"/>
+        </w:rPr>
+        <w:t>。该端到端运行限定在</w:t>
+      </w:r>
+      <w:r>
+        <w:rPr>
+          <w:rFonts w:ascii="Microsoft YaHei" w:hAnsi="Microsoft YaHei" w:eastAsia="Microsoft YaHei"/>
+          <w:b/>
+          <w:sz w:val="21"/>
+        </w:rPr>
+        <w:t>本地官方源码部署</w:t>
+      </w:r>
+      <w:r>
+        <w:rPr>
+          <w:rFonts w:ascii="Microsoft YaHei" w:hAnsi="Microsoft YaHei" w:eastAsia="Microsoft YaHei"/>
+          <w:sz w:val="21"/>
+        </w:rPr>
+        <w:t>， 不等于华为 AgentArts 托管平台内跑通。</w:t>
       </w:r>
     </w:p>
     <w:p>
@@ -5017,23 +5156,16 @@
           <w:rFonts w:ascii="Microsoft YaHei" w:hAnsi="Microsoft YaHei" w:eastAsia="Microsoft YaHei"/>
           <w:sz w:val="21"/>
         </w:rPr>
-        <w:t>2026-09-29：在本地官方源码部署中创建并发布</w:t>
+        <w:t>2026-09-29：在本地官方源码部署中创建并发布 Agent（R-NX-04，发布版本</w:t>
       </w:r>
     </w:p>
     <w:p>
-      <w:r>
-        <w:rPr>
-          <w:rFonts w:ascii="Consolas" w:hAnsi="Consolas" w:eastAsia="Microsoft YaHei"/>
-          <w:sz w:val="20"/>
-        </w:rPr>
-        <w:t>seasight-governance-decision-agent</w:t>
-      </w:r>
       <w:r>
         <w:rPr>
           <w:rFonts w:ascii="Microsoft YaHei" w:hAnsi="Microsoft YaHei" w:eastAsia="Microsoft YaHei"/>
           <w:sz w:val="21"/>
         </w:rPr>
-        <w:t>（R-NX-04），绑定 5 个 Skill 与 21 个 MCP 工具，发布版本 v2，调用关系 API 返回 21 个 MCP 工具，导出 Agent 配置 ZIP；未配置 LLM，完整问答待模型端点接入后补验。</w:t>
+        <w:t>v2），绑定 5 个 Skill 与 21 个 MCP 工具，调用关系 API 返回 21 个 MCP 工具，导出 Agent 配置 ZIP；当时未配置 LLM，完整问答列为待补。</w:t>
       </w:r>
     </w:p>
     <w:p>
@@ -5046,7 +5178,7 @@
           <w:rFonts w:ascii="Microsoft YaHei" w:hAnsi="Microsoft YaHei" w:eastAsia="Microsoft YaHei"/>
           <w:sz w:val="21"/>
         </w:rPr>
-        <w:t>2026-09-29：真实后端跑通知识进化闭环 R-KN-01：2 资产、4 版本、60 候选、</w:t>
+        <w:t>2026-09-30：本地官方源码部署完成模型接入与完整问答（R-NX-09）：Agent</w:t>
       </w:r>
     </w:p>
     <w:p>
@@ -5055,7 +5187,203 @@
           <w:rFonts w:ascii="Microsoft YaHei" w:hAnsi="Microsoft YaHei" w:eastAsia="Microsoft YaHei"/>
           <w:sz w:val="21"/>
         </w:rPr>
-        <w:t>图谱多跳检索 4 命中、决策证据 4 条。</w:t>
+        <w:t xml:space="preserve">identifier 修正为 </w:t>
+      </w:r>
+      <w:r>
+        <w:rPr>
+          <w:rFonts w:ascii="Consolas" w:hAnsi="Consolas" w:eastAsia="Microsoft YaHei"/>
+          <w:sz w:val="20"/>
+        </w:rPr>
+        <w:t>seasight_governance_decision_agent</w:t>
+      </w:r>
+      <w:r>
+        <w:rPr>
+          <w:rFonts w:ascii="Microsoft YaHei" w:hAnsi="Microsoft YaHei" w:eastAsia="Microsoft YaHei"/>
+          <w:sz w:val="21"/>
+        </w:rPr>
+        <w:t xml:space="preserve">（Nexent 要求合法 Python 标识符，连字符形式会被运行时拒绝），发布版本 4 </w:t>
+      </w:r>
+      <w:r>
+        <w:rPr>
+          <w:rFonts w:ascii="Consolas" w:hAnsi="Consolas" w:eastAsia="Microsoft YaHei"/>
+          <w:sz w:val="20"/>
+        </w:rPr>
+        <w:t>v0.2.0-seasight-governance-llm</w:t>
+      </w:r>
+      <w:r>
+        <w:rPr>
+          <w:rFonts w:ascii="Microsoft YaHei" w:hAnsi="Microsoft YaHei" w:eastAsia="Microsoft YaHei"/>
+          <w:sz w:val="21"/>
+        </w:rPr>
+        <w:t xml:space="preserve">，配置 DeepSeek </w:t>
+      </w:r>
+      <w:r>
+        <w:rPr>
+          <w:rFonts w:ascii="Consolas" w:hAnsi="Consolas" w:eastAsia="Microsoft YaHei"/>
+          <w:sz w:val="20"/>
+        </w:rPr>
+        <w:t>deepseek-v4-pro</w:t>
+      </w:r>
+      <w:r>
+        <w:rPr>
+          <w:rFonts w:ascii="Microsoft YaHei" w:hAnsi="Microsoft YaHei" w:eastAsia="Microsoft YaHei"/>
+          <w:sz w:val="21"/>
+        </w:rPr>
+        <w:t xml:space="preserve">，经 </w:t>
+      </w:r>
+      <w:r>
+        <w:rPr>
+          <w:rFonts w:ascii="Consolas" w:hAnsi="Consolas" w:eastAsia="Microsoft YaHei"/>
+          <w:sz w:val="20"/>
+        </w:rPr>
+        <w:t>POST /agent/run</w:t>
+      </w:r>
+      <w:r>
+        <w:rPr>
+          <w:rFonts w:ascii="Microsoft YaHei" w:hAnsi="Microsoft YaHei" w:eastAsia="Microsoft YaHei"/>
+          <w:sz w:val="21"/>
+        </w:rPr>
+        <w:t>（SSE）跑通一次真实 LLM Skill 问答：HTTP 200、13,204 个事件、8 步、31 次工具调用、13 个唯一工具、无 run error，最终回答 2,777 字；</w:t>
+      </w:r>
+      <w:r>
+        <w:rPr>
+          <w:rFonts w:ascii="Consolas" w:hAnsi="Consolas" w:eastAsia="Microsoft YaHei"/>
+          <w:sz w:val="20"/>
+        </w:rPr>
+        <w:t>read_skill_md</w:t>
+      </w:r>
+      <w:r>
+        <w:rPr>
+          <w:rFonts w:ascii="Microsoft YaHei" w:hAnsi="Microsoft YaHei" w:eastAsia="Microsoft YaHei"/>
+          <w:sz w:val="21"/>
+        </w:rPr>
+        <w:t xml:space="preserve"> 实际加载 </w:t>
+      </w:r>
+      <w:r>
+        <w:rPr>
+          <w:rFonts w:ascii="Consolas" w:hAnsi="Consolas" w:eastAsia="Microsoft YaHei"/>
+          <w:sz w:val="20"/>
+        </w:rPr>
+        <w:t>policy-evidence-qa</w:t>
+      </w:r>
+      <w:r>
+        <w:rPr>
+          <w:rFonts w:ascii="Microsoft YaHei" w:hAnsi="Microsoft YaHei" w:eastAsia="Microsoft YaHei"/>
+          <w:sz w:val="21"/>
+        </w:rPr>
+        <w:t xml:space="preserve">、 </w:t>
+      </w:r>
+      <w:r>
+        <w:rPr>
+          <w:rFonts w:ascii="Consolas" w:hAnsi="Consolas" w:eastAsia="Microsoft YaHei"/>
+          <w:sz w:val="20"/>
+        </w:rPr>
+        <w:t>marine-event-assessment</w:t>
+      </w:r>
+      <w:r>
+        <w:rPr>
+          <w:rFonts w:ascii="Microsoft YaHei" w:hAnsi="Microsoft YaHei" w:eastAsia="Microsoft YaHei"/>
+          <w:sz w:val="21"/>
+        </w:rPr>
+        <w:t>、</w:t>
+      </w:r>
+      <w:r>
+        <w:rPr>
+          <w:rFonts w:ascii="Consolas" w:hAnsi="Consolas" w:eastAsia="Microsoft YaHei"/>
+          <w:sz w:val="20"/>
+        </w:rPr>
+        <w:t>dispatch-work-order-orchestration</w:t>
+      </w:r>
+      <w:r>
+        <w:rPr>
+          <w:rFonts w:ascii="Microsoft YaHei" w:hAnsi="Microsoft YaHei" w:eastAsia="Microsoft YaHei"/>
+          <w:sz w:val="21"/>
+        </w:rPr>
+        <w:t xml:space="preserve">、 </w:t>
+      </w:r>
+      <w:r>
+        <w:rPr>
+          <w:rFonts w:ascii="Consolas" w:hAnsi="Consolas" w:eastAsia="Microsoft YaHei"/>
+          <w:sz w:val="20"/>
+        </w:rPr>
+        <w:t>decision-trace-audit</w:t>
+      </w:r>
+      <w:r>
+        <w:rPr>
+          <w:rFonts w:ascii="Microsoft YaHei" w:hAnsi="Microsoft YaHei" w:eastAsia="Microsoft YaHei"/>
+          <w:sz w:val="21"/>
+        </w:rPr>
+        <w:t xml:space="preserve"> 4 个 Skill（第 5 个 </w:t>
+      </w:r>
+      <w:r>
+        <w:rPr>
+          <w:rFonts w:ascii="Consolas" w:hAnsi="Consolas" w:eastAsia="Microsoft YaHei"/>
+          <w:sz w:val="20"/>
+        </w:rPr>
+        <w:t>cross-document-decision</w:t>
+      </w:r>
+      <w:r>
+        <w:rPr>
+          <w:rFonts w:ascii="Microsoft YaHei" w:hAnsi="Microsoft YaHei" w:eastAsia="Microsoft YaHei"/>
+          <w:sz w:val="21"/>
+        </w:rPr>
+        <w:t xml:space="preserve"> 已绑定但本次问题未触发）。调试中发现并修复控制台不可见问题：模型状态需为 </w:t>
+      </w:r>
+      <w:r>
+        <w:rPr>
+          <w:rFonts w:ascii="Consolas" w:hAnsi="Consolas" w:eastAsia="Microsoft YaHei"/>
+          <w:sz w:val="20"/>
+        </w:rPr>
+        <w:t>available</w:t>
+      </w:r>
+      <w:r>
+        <w:rPr>
+          <w:rFonts w:ascii="Microsoft YaHei" w:hAnsi="Microsoft YaHei" w:eastAsia="Microsoft YaHei"/>
+          <w:sz w:val="21"/>
+        </w:rPr>
+        <w:t xml:space="preserve">，经官方 </w:t>
+      </w:r>
+      <w:r>
+        <w:rPr>
+          <w:rFonts w:ascii="Consolas" w:hAnsi="Consolas" w:eastAsia="Microsoft YaHei"/>
+          <w:sz w:val="20"/>
+        </w:rPr>
+        <w:t>/api/model/healthcheck</w:t>
+      </w:r>
+      <w:r>
+        <w:rPr>
+          <w:rFonts w:ascii="Microsoft YaHei" w:hAnsi="Microsoft YaHei" w:eastAsia="Microsoft YaHei"/>
+          <w:sz w:val="21"/>
+        </w:rPr>
+        <w:t xml:space="preserve"> 后 </w:t>
+      </w:r>
+      <w:r>
+        <w:rPr>
+          <w:rFonts w:ascii="Consolas" w:hAnsi="Consolas" w:eastAsia="Microsoft YaHei"/>
+          <w:sz w:val="20"/>
+        </w:rPr>
+        <w:t>/api/agent/list</w:t>
+      </w:r>
+      <w:r>
+        <w:rPr>
+          <w:rFonts w:ascii="Microsoft YaHei" w:hAnsi="Microsoft YaHei" w:eastAsia="Microsoft YaHei"/>
+          <w:sz w:val="21"/>
+        </w:rPr>
+        <w:t xml:space="preserve"> 返回 </w:t>
+      </w:r>
+      <w:r>
+        <w:rPr>
+          <w:rFonts w:ascii="Consolas" w:hAnsi="Consolas" w:eastAsia="Microsoft YaHei"/>
+          <w:sz w:val="20"/>
+        </w:rPr>
+        <w:t>is_available: true</w:t>
+      </w:r>
+      <w:r>
+        <w:rPr>
+          <w:rFonts w:ascii="Microsoft YaHei" w:hAnsi="Microsoft YaHei" w:eastAsia="Microsoft YaHei"/>
+          <w:sz w:val="21"/>
+        </w:rPr>
+        <w:t>，控制台恢复可见。该问答在证据不足时明确输出 “不适用/不可自动派单”结论并列出 4 项证据缺口，未伪造政策依据。</w:t>
       </w:r>
     </w:p>
     <w:p>
@@ -5068,23 +5396,16 @@
           <w:rFonts w:ascii="Microsoft YaHei" w:hAnsi="Microsoft YaHei" w:eastAsia="Microsoft YaHei"/>
           <w:sz w:val="21"/>
         </w:rPr>
-        <w:t>2026-09-29：本体候选抽取确定性评测通过（R-KN-02），结果见</w:t>
+        <w:t>2026-09-29：真实后端跑通知识进化闭环 R-KN-01：2 资产、4 版本、60 候选、</w:t>
       </w:r>
     </w:p>
     <w:p>
-      <w:r>
-        <w:rPr>
-          <w:rFonts w:ascii="Consolas" w:hAnsi="Consolas" w:eastAsia="Microsoft YaHei"/>
-          <w:sz w:val="20"/>
-        </w:rPr>
-        <w:t>artifacts/ontology-eval/latest.json</w:t>
-      </w:r>
       <w:r>
         <w:rPr>
           <w:rFonts w:ascii="Microsoft YaHei" w:hAnsi="Microsoft YaHei" w:eastAsia="Microsoft YaHei"/>
           <w:sz w:val="21"/>
         </w:rPr>
-        <w:t>；E1 软件内部结果，不是真实脱敏 行业数据评测、领域准确率或感知精度。</w:t>
+        <w:t>图谱多跳检索 4 命中、决策证据 4 条。</w:t>
       </w:r>
     </w:p>
     <w:p>
@@ -5097,16 +5418,23 @@
           <w:rFonts w:ascii="Microsoft YaHei" w:hAnsi="Microsoft YaHei" w:eastAsia="Microsoft YaHei"/>
           <w:sz w:val="21"/>
         </w:rPr>
-        <w:t>2026-09-29：知识域问答轨迹采集通过（R-KN-04）：真实后端执行</w:t>
+        <w:t>2026-09-29：本体候选抽取确定性评测通过（R-KN-02），结果见</w:t>
       </w:r>
     </w:p>
     <w:p>
+      <w:r>
+        <w:rPr>
+          <w:rFonts w:ascii="Consolas" w:hAnsi="Consolas" w:eastAsia="Microsoft YaHei"/>
+          <w:sz w:val="20"/>
+        </w:rPr>
+        <w:t>artifacts/ontology-eval/latest.json</w:t>
+      </w:r>
       <w:r>
         <w:rPr>
           <w:rFonts w:ascii="Microsoft YaHei" w:hAnsi="Microsoft YaHei" w:eastAsia="Microsoft YaHei"/>
           <w:sz w:val="21"/>
         </w:rPr>
-        <w:t>“问题 → 检索（ontology_graph，4 条命中）→ 创建决策 → 读取 4 条有序 证据链”，保存 API JSON 与 2 张界面截图；轨迹为 hop=0 的直接资产引用 检索，不是多跳路径、不是 LLM 生成式问答。</w:t>
+        <w:t>；E1 软件内部结果，不是真实脱敏 行业数据评测、领域准确率或感知精度。</w:t>
       </w:r>
     </w:p>
     <w:p>
@@ -5119,7 +5447,7 @@
           <w:rFonts w:ascii="Microsoft YaHei" w:hAnsi="Microsoft YaHei" w:eastAsia="Microsoft YaHei"/>
           <w:sz w:val="21"/>
         </w:rPr>
-        <w:t>2026-09-29：公开开放数据本体抽取评测通过（R-OD-01）：8 份生态环境部</w:t>
+        <w:t>2026-09-29：知识域问答轨迹采集通过（R-KN-04）：真实后端执行</w:t>
       </w:r>
     </w:p>
     <w:p>
@@ -5128,7 +5456,7 @@
           <w:rFonts w:ascii="Microsoft YaHei" w:hAnsi="Microsoft YaHei" w:eastAsia="Microsoft YaHei"/>
           <w:sz w:val="21"/>
         </w:rPr>
-        <w:t>公开通知，来源 URL 与 SHA256 可追溯；全量候选覆盖内部标注术语 23/32、 关系 3/3；top-20 术语覆盖 21.9%（朴素基线 28.1%），不据此宣称识别 更准；为 E1 替代证据，不是真实脱敏行业数据评测。</w:t>
+        <w:t>“问题 → 检索（ontology_graph，4 条命中）→ 创建决策 → 读取 4 条有序 证据链”，保存 API JSON 与 2 张界面截图；轨迹为 hop=0 的直接资产引用 检索，不是多跳路径、不是 LLM 生成式问答。</w:t>
       </w:r>
     </w:p>
     <w:p>
@@ -5141,7 +5469,7 @@
           <w:rFonts w:ascii="Microsoft YaHei" w:hAnsi="Microsoft YaHei" w:eastAsia="Microsoft YaHei"/>
           <w:sz w:val="21"/>
         </w:rPr>
-        <w:t>华为托管平台（AgentArts，区域 cn-southwest-2）MCP 注册与公网端点真实只读</w:t>
+        <w:t>2026-09-29：公开开放数据本体抽取评测通过（R-OD-01）：8 份生态环境部</w:t>
       </w:r>
     </w:p>
     <w:p>
@@ -5150,35 +5478,7 @@
           <w:rFonts w:ascii="Microsoft YaHei" w:hAnsi="Microsoft YaHei" w:eastAsia="Microsoft YaHei"/>
           <w:sz w:val="21"/>
         </w:rPr>
-        <w:t>调用已于 2026-09-29 完成并登记 R-NX-05：</w:t>
-      </w:r>
-      <w:r>
-        <w:rPr>
-          <w:rFonts w:ascii="Consolas" w:hAnsi="Consolas" w:eastAsia="Microsoft YaHei"/>
-          <w:sz w:val="20"/>
-        </w:rPr>
-        <w:t>SeaSight Domain Cognition MCP</w:t>
-      </w:r>
-      <w:r>
-        <w:rPr>
-          <w:rFonts w:ascii="Microsoft YaHei" w:hAnsi="Microsoft YaHei" w:eastAsia="Microsoft YaHei"/>
-          <w:sz w:val="21"/>
-        </w:rPr>
-        <w:t xml:space="preserve"> 状态“部署成功”，工具列表加载 21 个只读工具，</w:t>
-      </w:r>
-      <w:r>
-        <w:rPr>
-          <w:rFonts w:ascii="Consolas" w:hAnsi="Consolas" w:eastAsia="Microsoft YaHei"/>
-          <w:sz w:val="20"/>
-        </w:rPr>
-        <w:t>knowledge_list_assets</w:t>
-      </w:r>
-      <w:r>
-        <w:rPr>
-          <w:rFonts w:ascii="Microsoft YaHei" w:hAnsi="Microsoft YaHei" w:eastAsia="Microsoft YaHei"/>
-          <w:sz w:val="21"/>
-        </w:rPr>
-        <w:t xml:space="preserve"> 返回 total=4；托管平台 Skills 导入与控制台调试调用输出仍待手动完成。</w:t>
+        <w:t>公开通知，来源 URL 与 SHA256 可追溯；全量候选覆盖内部标注术语 23/32、 关系 3/3；top-20 术语覆盖 21.9%（朴素基线 28.1%），不据此宣称识别 更准；为 E1 替代证据，不是真实脱敏行业数据评测。</w:t>
       </w:r>
     </w:p>
     <w:p>
@@ -5191,6 +5491,56 @@
           <w:rFonts w:ascii="Microsoft YaHei" w:hAnsi="Microsoft YaHei" w:eastAsia="Microsoft YaHei"/>
           <w:sz w:val="21"/>
         </w:rPr>
+        <w:t>华为托管平台（AgentArts，区域 cn-southwest-2）MCP 注册与公网端点真实只读</w:t>
+      </w:r>
+    </w:p>
+    <w:p>
+      <w:r>
+        <w:rPr>
+          <w:rFonts w:ascii="Microsoft YaHei" w:hAnsi="Microsoft YaHei" w:eastAsia="Microsoft YaHei"/>
+          <w:sz w:val="21"/>
+        </w:rPr>
+        <w:t>调用已于 2026-09-29 完成并登记 R-NX-05：</w:t>
+      </w:r>
+      <w:r>
+        <w:rPr>
+          <w:rFonts w:ascii="Consolas" w:hAnsi="Consolas" w:eastAsia="Microsoft YaHei"/>
+          <w:sz w:val="20"/>
+        </w:rPr>
+        <w:t>SeaSight Domain Cognition MCP</w:t>
+      </w:r>
+      <w:r>
+        <w:rPr>
+          <w:rFonts w:ascii="Microsoft YaHei" w:hAnsi="Microsoft YaHei" w:eastAsia="Microsoft YaHei"/>
+          <w:sz w:val="21"/>
+        </w:rPr>
+        <w:t xml:space="preserve"> 状态“部署成功”，工具列表加载 21 个只读工具，</w:t>
+      </w:r>
+      <w:r>
+        <w:rPr>
+          <w:rFonts w:ascii="Consolas" w:hAnsi="Consolas" w:eastAsia="Microsoft YaHei"/>
+          <w:sz w:val="20"/>
+        </w:rPr>
+        <w:t>knowledge_list_assets</w:t>
+      </w:r>
+      <w:r>
+        <w:rPr>
+          <w:rFonts w:ascii="Microsoft YaHei" w:hAnsi="Microsoft YaHei" w:eastAsia="Microsoft YaHei"/>
+          <w:sz w:val="21"/>
+        </w:rPr>
+        <w:t xml:space="preserve"> 返回 total=4；当日 Skills 导入与控制台调用输出尚未完成，后续在 2026-09-30 复核中确认 5 个 Skill 已全部导入（见 R-NX-07），控制台内完整问答输出仍受 Target 阻断。</w:t>
+      </w:r>
+    </w:p>
+    <w:p>
+      <w:pPr>
+        <w:pStyle w:val="ListBullet"/>
+        <w:ind w:left="346" w:hanging="259"/>
+      </w:pPr>
+      <w:r>
+        <w:rPr>
+          <w:rFonts w:ascii="Microsoft YaHei" w:hAnsi="Microsoft YaHei" w:eastAsia="Microsoft YaHei"/>
+          <w:sz w:val="21"/>
+        </w:rPr>
         <w:t>2026-09-29：华为托管平台（AgentArts）创建 Agent</w:t>
       </w:r>
     </w:p>
@@ -5222,6 +5572,98 @@
           <w:sz w:val="21"/>
         </w:rPr>
         <w:t>，写入诚实系统提示词；编辑页明确提示 公网环境不支持 Skill（Skill 绑定按钮 disabled），平台限制已留证。完整 Skill 问答需私网环境 + 私网可访问 MCP endpoint 后验收。</w:t>
+      </w:r>
+    </w:p>
+    <w:p>
+      <w:pPr>
+        <w:pStyle w:val="ListBullet"/>
+        <w:ind w:left="346" w:hanging="259"/>
+      </w:pPr>
+      <w:r>
+        <w:rPr>
+          <w:rFonts w:ascii="Microsoft YaHei" w:hAnsi="Microsoft YaHei" w:eastAsia="Microsoft YaHei"/>
+          <w:sz w:val="21"/>
+        </w:rPr>
+        <w:t xml:space="preserve">2026-09-30：华为托管平台私网路径复核受阻（R-NX-07 </w:t>
+      </w:r>
+      <w:r>
+        <w:rPr>
+          <w:rFonts w:ascii="Consolas" w:hAnsi="Consolas" w:eastAsia="Microsoft YaHei"/>
+          <w:sz w:val="20"/>
+        </w:rPr>
+        <w:t>blocked</w:t>
+      </w:r>
+      <w:r>
+        <w:rPr>
+          <w:rFonts w:ascii="Microsoft YaHei" w:hAnsi="Microsoft YaHei" w:eastAsia="Microsoft YaHei"/>
+          <w:sz w:val="21"/>
+        </w:rPr>
+        <w:t>）：已建</w:t>
+      </w:r>
+    </w:p>
+    <w:p>
+      <w:r>
+        <w:rPr>
+          <w:rFonts w:ascii="Microsoft YaHei" w:hAnsi="Microsoft YaHei" w:eastAsia="Microsoft YaHei"/>
+          <w:sz w:val="21"/>
+        </w:rPr>
+        <w:t xml:space="preserve">私网环境 </w:t>
+      </w:r>
+      <w:r>
+        <w:rPr>
+          <w:rFonts w:ascii="Consolas" w:hAnsi="Consolas" w:eastAsia="Microsoft YaHei"/>
+          <w:sz w:val="20"/>
+        </w:rPr>
+        <w:t>environment-seasight-vpc-verify</w:t>
+      </w:r>
+      <w:r>
+        <w:rPr>
+          <w:rFonts w:ascii="Microsoft YaHei" w:hAnsi="Microsoft YaHei" w:eastAsia="Microsoft YaHei"/>
+          <w:sz w:val="21"/>
+        </w:rPr>
+        <w:t xml:space="preserve"> 与网关 </w:t>
+      </w:r>
+      <w:r>
+        <w:rPr>
+          <w:rFonts w:ascii="Consolas" w:hAnsi="Consolas" w:eastAsia="Microsoft YaHei"/>
+          <w:sz w:val="20"/>
+        </w:rPr>
+        <w:t>seasight-vpc-gateway</w:t>
+      </w:r>
+      <w:r>
+        <w:rPr>
+          <w:rFonts w:ascii="Microsoft YaHei" w:hAnsi="Microsoft YaHei" w:eastAsia="Microsoft YaHei"/>
+          <w:sz w:val="21"/>
+        </w:rPr>
+        <w:t xml:space="preserve">，但 华为云账号欠费使“创建 Target”原生 disabled（0/10），Agent 启用 VPC 报 </w:t>
+      </w:r>
+      <w:r>
+        <w:rPr>
+          <w:rFonts w:ascii="Consolas" w:hAnsi="Consolas" w:eastAsia="Microsoft YaHei"/>
+          <w:sz w:val="20"/>
+        </w:rPr>
+        <w:t>AgentArts.03002206</w:t>
+      </w:r>
+      <w:r>
+        <w:rPr>
+          <w:rFonts w:ascii="Microsoft YaHei" w:hAnsi="Microsoft YaHei" w:eastAsia="Microsoft YaHei"/>
+          <w:sz w:val="21"/>
+        </w:rPr>
+        <w:t xml:space="preserve">；经验教训是托管平台 Skill 验收必须同时满足 “私网环境 + 可达 endpoint + Target 绑定”，缺一不可，不能用临时隧道或 </w:t>
+      </w:r>
+      <w:r>
+        <w:rPr>
+          <w:rFonts w:ascii="Consolas" w:hAnsi="Consolas" w:eastAsia="Microsoft YaHei"/>
+          <w:sz w:val="20"/>
+        </w:rPr>
+        <w:t>127.0.0.1</w:t>
+      </w:r>
+      <w:r>
+        <w:rPr>
+          <w:rFonts w:ascii="Microsoft YaHei" w:hAnsi="Microsoft YaHei" w:eastAsia="Microsoft YaHei"/>
+          <w:sz w:val="21"/>
+        </w:rPr>
+        <w:t xml:space="preserve"> 代替。</w:t>
       </w:r>
     </w:p>
     <w:p>
@@ -6674,7 +7116,7 @@
                 <w:color w:val="000000"/>
                 <w:sz w:val="17"/>
               </w:rPr>
-              <w:t>R-NX-05</w:t>
+              <w:t>R-NX-03B</w:t>
             </w:r>
           </w:p>
         </w:tc>
@@ -6709,6 +7151,162 @@
                 <w:color w:val="000000"/>
                 <w:sz w:val="17"/>
               </w:rPr>
+              <w:t>本地 MCP 端点复验：</w:t>
+            </w:r>
+            <w:r>
+              <w:rPr>
+                <w:rFonts w:ascii="Consolas" w:hAnsi="Consolas" w:eastAsia="Microsoft YaHei"/>
+                <w:color w:val="000000"/>
+                <w:sz w:val="16"/>
+              </w:rPr>
+              <w:t>mcp 1.30.0</w:t>
+            </w:r>
+            <w:r>
+              <w:rPr>
+                <w:rFonts w:ascii="Microsoft YaHei" w:hAnsi="Microsoft YaHei" w:eastAsia="Microsoft YaHei"/>
+                <w:color w:val="000000"/>
+                <w:sz w:val="17"/>
+              </w:rPr>
+              <w:t xml:space="preserve"> / 协议 </w:t>
+            </w:r>
+            <w:r>
+              <w:rPr>
+                <w:rFonts w:ascii="Consolas" w:hAnsi="Consolas" w:eastAsia="Microsoft YaHei"/>
+                <w:color w:val="000000"/>
+                <w:sz w:val="16"/>
+              </w:rPr>
+              <w:t>2025-11-25</w:t>
+            </w:r>
+            <w:r>
+              <w:rPr>
+                <w:rFonts w:ascii="Microsoft YaHei" w:hAnsi="Microsoft YaHei" w:eastAsia="Microsoft YaHei"/>
+                <w:color w:val="000000"/>
+                <w:sz w:val="17"/>
+              </w:rPr>
+              <w:t>、21 工具、3 次真实只读调用</w:t>
+            </w:r>
+          </w:p>
+        </w:tc>
+        <w:tc>
+          <w:tcPr>
+            <w:tcW w:type="dxa" w:w="4612"/>
+            <w:vAlign w:val="center"/>
+            <w:tcMar>
+              <w:top w:w="38" w:type="dxa"/>
+              <w:start w:w="70" w:type="dxa"/>
+              <w:bottom w:w="38" w:type="dxa"/>
+              <w:end w:w="70" w:type="dxa"/>
+            </w:tcMar>
+            <w:tcBorders>
+              <w:top w:val="single" w:sz="6" w:space="0" w:color="D9D9D9"/>
+              <w:left w:val="single" w:sz="6" w:space="0" w:color="D9D9D9"/>
+              <w:bottom w:val="single" w:sz="6" w:space="0" w:color="D9D9D9"/>
+              <w:right w:val="single" w:sz="6" w:space="0" w:color="D9D9D9"/>
+              <w:insideH w:val="single" w:sz="6" w:space="0" w:color="D9D9D9"/>
+              <w:insideV w:val="single" w:sz="6" w:space="0" w:color="D9D9D9"/>
+            </w:tcBorders>
+            <w:shd w:fill="F3F7FA"/>
+          </w:tcPr>
+          <w:p>
+            <w:pPr>
+              <w:spacing w:after="0" w:line="252" w:lineRule="auto"/>
+              <w:jc w:val="left"/>
+            </w:pPr>
+            <w:r>
+              <w:rPr>
+                <w:rFonts w:ascii="Consolas" w:hAnsi="Consolas" w:eastAsia="Microsoft YaHei"/>
+                <w:color w:val="000000"/>
+                <w:sz w:val="16"/>
+              </w:rPr>
+              <w:t>artifacts/nexent-platform-acceptance/recheck-2026-09-30.yaml</w:t>
+            </w:r>
+            <w:r>
+              <w:rPr>
+                <w:rFonts w:ascii="Microsoft YaHei" w:hAnsi="Microsoft YaHei" w:eastAsia="Microsoft YaHei"/>
+                <w:color w:val="000000"/>
+                <w:sz w:val="17"/>
+              </w:rPr>
+              <w:t xml:space="preserve"> + </w:t>
+            </w:r>
+            <w:r>
+              <w:rPr>
+                <w:rFonts w:ascii="Consolas" w:hAnsi="Consolas" w:eastAsia="Microsoft YaHei"/>
+                <w:color w:val="000000"/>
+                <w:sz w:val="16"/>
+              </w:rPr>
+              <w:t>evidence/recheck-2026-09-30/</w:t>
+            </w:r>
+          </w:p>
+        </w:tc>
+      </w:tr>
+      <w:tr>
+        <w:trPr>
+          <w:cantSplit w:val="true"/>
+        </w:trPr>
+        <w:tc>
+          <w:tcPr>
+            <w:tcW w:type="dxa" w:w="1152"/>
+            <w:vAlign w:val="center"/>
+            <w:tcMar>
+              <w:top w:w="38" w:type="dxa"/>
+              <w:start w:w="70" w:type="dxa"/>
+              <w:bottom w:w="38" w:type="dxa"/>
+              <w:end w:w="70" w:type="dxa"/>
+            </w:tcMar>
+            <w:tcBorders>
+              <w:top w:val="single" w:sz="6" w:space="0" w:color="D9D9D9"/>
+              <w:left w:val="single" w:sz="6" w:space="0" w:color="D9D9D9"/>
+              <w:bottom w:val="single" w:sz="6" w:space="0" w:color="D9D9D9"/>
+              <w:right w:val="single" w:sz="6" w:space="0" w:color="D9D9D9"/>
+              <w:insideH w:val="single" w:sz="6" w:space="0" w:color="D9D9D9"/>
+              <w:insideV w:val="single" w:sz="6" w:space="0" w:color="D9D9D9"/>
+            </w:tcBorders>
+          </w:tcPr>
+          <w:p>
+            <w:pPr>
+              <w:spacing w:after="0" w:line="252" w:lineRule="auto"/>
+              <w:jc w:val="center"/>
+            </w:pPr>
+            <w:r>
+              <w:rPr>
+                <w:rFonts w:ascii="Microsoft YaHei" w:hAnsi="Microsoft YaHei" w:eastAsia="Microsoft YaHei"/>
+                <w:color w:val="000000"/>
+                <w:sz w:val="17"/>
+              </w:rPr>
+              <w:t>R-NX-05</w:t>
+            </w:r>
+          </w:p>
+        </w:tc>
+        <w:tc>
+          <w:tcPr>
+            <w:tcW w:type="dxa" w:w="4229"/>
+            <w:vAlign w:val="center"/>
+            <w:tcMar>
+              <w:top w:w="38" w:type="dxa"/>
+              <w:start w:w="70" w:type="dxa"/>
+              <w:bottom w:w="38" w:type="dxa"/>
+              <w:end w:w="70" w:type="dxa"/>
+            </w:tcMar>
+            <w:tcBorders>
+              <w:top w:val="single" w:sz="6" w:space="0" w:color="D9D9D9"/>
+              <w:left w:val="single" w:sz="6" w:space="0" w:color="D9D9D9"/>
+              <w:bottom w:val="single" w:sz="6" w:space="0" w:color="D9D9D9"/>
+              <w:right w:val="single" w:sz="6" w:space="0" w:color="D9D9D9"/>
+              <w:insideH w:val="single" w:sz="6" w:space="0" w:color="D9D9D9"/>
+              <w:insideV w:val="single" w:sz="6" w:space="0" w:color="D9D9D9"/>
+            </w:tcBorders>
+          </w:tcPr>
+          <w:p>
+            <w:pPr>
+              <w:spacing w:after="0" w:line="252" w:lineRule="auto"/>
+              <w:jc w:val="left"/>
+            </w:pPr>
+            <w:r>
+              <w:rPr>
+                <w:rFonts w:ascii="Microsoft YaHei" w:hAnsi="Microsoft YaHei" w:eastAsia="Microsoft YaHei"/>
+                <w:color w:val="000000"/>
+                <w:sz w:val="17"/>
+              </w:rPr>
               <w:t>华为托管平台（AgentArts）MCP 注册、21 工具加载、公网端点真实只读调用 total=4</w:t>
             </w:r>
           </w:p>
@@ -6731,7 +7329,6 @@
               <w:insideH w:val="single" w:sz="6" w:space="0" w:color="D9D9D9"/>
               <w:insideV w:val="single" w:sz="6" w:space="0" w:color="D9D9D9"/>
             </w:tcBorders>
-            <w:shd w:fill="F3F7FA"/>
           </w:tcPr>
           <w:p>
             <w:pPr>
@@ -6787,6 +7384,7 @@
               <w:insideH w:val="single" w:sz="6" w:space="0" w:color="D9D9D9"/>
               <w:insideV w:val="single" w:sz="6" w:space="0" w:color="D9D9D9"/>
             </w:tcBorders>
+            <w:shd w:fill="F3F7FA"/>
           </w:tcPr>
           <w:p>
             <w:pPr>
@@ -6821,6 +7419,7 @@
               <w:insideH w:val="single" w:sz="6" w:space="0" w:color="D9D9D9"/>
               <w:insideV w:val="single" w:sz="6" w:space="0" w:color="D9D9D9"/>
             </w:tcBorders>
+            <w:shd w:fill="F3F7FA"/>
           </w:tcPr>
           <w:p>
             <w:pPr>
@@ -6855,6 +7454,7 @@
               <w:insideH w:val="single" w:sz="6" w:space="0" w:color="D9D9D9"/>
               <w:insideV w:val="single" w:sz="6" w:space="0" w:color="D9D9D9"/>
             </w:tcBorders>
+            <w:shd w:fill="F3F7FA"/>
           </w:tcPr>
           <w:p>
             <w:pPr>
@@ -6894,7 +7494,313 @@
               <w:insideH w:val="single" w:sz="6" w:space="0" w:color="D9D9D9"/>
               <w:insideV w:val="single" w:sz="6" w:space="0" w:color="D9D9D9"/>
             </w:tcBorders>
+          </w:tcPr>
+          <w:p>
+            <w:pPr>
+              <w:spacing w:after="0" w:line="252" w:lineRule="auto"/>
+              <w:jc w:val="center"/>
+            </w:pPr>
+            <w:r>
+              <w:rPr>
+                <w:rFonts w:ascii="Microsoft YaHei" w:hAnsi="Microsoft YaHei" w:eastAsia="Microsoft YaHei"/>
+                <w:color w:val="000000"/>
+                <w:sz w:val="17"/>
+              </w:rPr>
+              <w:t>R-NX-07</w:t>
+            </w:r>
+          </w:p>
+        </w:tc>
+        <w:tc>
+          <w:tcPr>
+            <w:tcW w:type="dxa" w:w="4229"/>
+            <w:vAlign w:val="center"/>
+            <w:tcMar>
+              <w:top w:w="38" w:type="dxa"/>
+              <w:start w:w="70" w:type="dxa"/>
+              <w:bottom w:w="38" w:type="dxa"/>
+              <w:end w:w="70" w:type="dxa"/>
+            </w:tcMar>
+            <w:tcBorders>
+              <w:top w:val="single" w:sz="6" w:space="0" w:color="D9D9D9"/>
+              <w:left w:val="single" w:sz="6" w:space="0" w:color="D9D9D9"/>
+              <w:bottom w:val="single" w:sz="6" w:space="0" w:color="D9D9D9"/>
+              <w:right w:val="single" w:sz="6" w:space="0" w:color="D9D9D9"/>
+              <w:insideH w:val="single" w:sz="6" w:space="0" w:color="D9D9D9"/>
+              <w:insideV w:val="single" w:sz="6" w:space="0" w:color="D9D9D9"/>
+            </w:tcBorders>
+          </w:tcPr>
+          <w:p>
+            <w:pPr>
+              <w:spacing w:after="0" w:line="252" w:lineRule="auto"/>
+              <w:jc w:val="left"/>
+            </w:pPr>
+            <w:r>
+              <w:rPr>
+                <w:rFonts w:ascii="Microsoft YaHei" w:hAnsi="Microsoft YaHei" w:eastAsia="Microsoft YaHei"/>
+                <w:color w:val="000000"/>
+                <w:sz w:val="17"/>
+              </w:rPr>
+              <w:t>华为托管平台完整 Skill 问答：</w:t>
+            </w:r>
+            <w:r>
+              <w:rPr>
+                <w:rFonts w:ascii="Microsoft YaHei" w:hAnsi="Microsoft YaHei" w:eastAsia="Microsoft YaHei"/>
+                <w:b/>
+                <w:color w:val="000000"/>
+                <w:sz w:val="17"/>
+              </w:rPr>
+              <w:t>blocked</w:t>
+            </w:r>
+            <w:r>
+              <w:rPr>
+                <w:rFonts w:ascii="Microsoft YaHei" w:hAnsi="Microsoft YaHei" w:eastAsia="Microsoft YaHei"/>
+                <w:color w:val="000000"/>
+                <w:sz w:val="17"/>
+              </w:rPr>
+              <w:t xml:space="preserve">。私网环境与网关已建；华为云账号欠费，创建 Target 原生 disabled（0/10），Agent 启用 VPC 时报 </w:t>
+            </w:r>
+            <w:r>
+              <w:rPr>
+                <w:rFonts w:ascii="Consolas" w:hAnsi="Consolas" w:eastAsia="Microsoft YaHei"/>
+                <w:color w:val="000000"/>
+                <w:sz w:val="16"/>
+              </w:rPr>
+              <w:t>AgentArts.03002206</w:t>
+            </w:r>
+          </w:p>
+        </w:tc>
+        <w:tc>
+          <w:tcPr>
+            <w:tcW w:type="dxa" w:w="4612"/>
+            <w:vAlign w:val="center"/>
+            <w:tcMar>
+              <w:top w:w="38" w:type="dxa"/>
+              <w:start w:w="70" w:type="dxa"/>
+              <w:bottom w:w="38" w:type="dxa"/>
+              <w:end w:w="70" w:type="dxa"/>
+            </w:tcMar>
+            <w:tcBorders>
+              <w:top w:val="single" w:sz="6" w:space="0" w:color="D9D9D9"/>
+              <w:left w:val="single" w:sz="6" w:space="0" w:color="D9D9D9"/>
+              <w:bottom w:val="single" w:sz="6" w:space="0" w:color="D9D9D9"/>
+              <w:right w:val="single" w:sz="6" w:space="0" w:color="D9D9D9"/>
+              <w:insideH w:val="single" w:sz="6" w:space="0" w:color="D9D9D9"/>
+              <w:insideV w:val="single" w:sz="6" w:space="0" w:color="D9D9D9"/>
+            </w:tcBorders>
+          </w:tcPr>
+          <w:p>
+            <w:pPr>
+              <w:spacing w:after="0" w:line="252" w:lineRule="auto"/>
+              <w:jc w:val="left"/>
+            </w:pPr>
+            <w:r>
+              <w:rPr>
+                <w:rFonts w:ascii="Consolas" w:hAnsi="Consolas" w:eastAsia="Microsoft YaHei"/>
+                <w:color w:val="000000"/>
+                <w:sz w:val="16"/>
+              </w:rPr>
+              <w:t>artifacts/nexent-platform-acceptance/hosted-2026-09-30-target-blocked.yaml</w:t>
+            </w:r>
+            <w:r>
+              <w:rPr>
+                <w:rFonts w:ascii="Microsoft YaHei" w:hAnsi="Microsoft YaHei" w:eastAsia="Microsoft YaHei"/>
+                <w:color w:val="000000"/>
+                <w:sz w:val="17"/>
+              </w:rPr>
+              <w:t xml:space="preserve"> + </w:t>
+            </w:r>
+            <w:r>
+              <w:rPr>
+                <w:rFonts w:ascii="Consolas" w:hAnsi="Consolas" w:eastAsia="Microsoft YaHei"/>
+                <w:color w:val="000000"/>
+                <w:sz w:val="16"/>
+              </w:rPr>
+              <w:t>evidence/hosted-2026-09-30-private-gateway-target-blocked.png</w:t>
+            </w:r>
+          </w:p>
+        </w:tc>
+      </w:tr>
+      <w:tr>
+        <w:trPr>
+          <w:cantSplit w:val="true"/>
+        </w:trPr>
+        <w:tc>
+          <w:tcPr>
+            <w:tcW w:type="dxa" w:w="1152"/>
+            <w:vAlign w:val="center"/>
+            <w:tcMar>
+              <w:top w:w="38" w:type="dxa"/>
+              <w:start w:w="70" w:type="dxa"/>
+              <w:bottom w:w="38" w:type="dxa"/>
+              <w:end w:w="70" w:type="dxa"/>
+            </w:tcMar>
+            <w:tcBorders>
+              <w:top w:val="single" w:sz="6" w:space="0" w:color="D9D9D9"/>
+              <w:left w:val="single" w:sz="6" w:space="0" w:color="D9D9D9"/>
+              <w:bottom w:val="single" w:sz="6" w:space="0" w:color="D9D9D9"/>
+              <w:right w:val="single" w:sz="6" w:space="0" w:color="D9D9D9"/>
+              <w:insideH w:val="single" w:sz="6" w:space="0" w:color="D9D9D9"/>
+              <w:insideV w:val="single" w:sz="6" w:space="0" w:color="D9D9D9"/>
+            </w:tcBorders>
             <w:shd w:fill="F3F7FA"/>
+          </w:tcPr>
+          <w:p>
+            <w:pPr>
+              <w:spacing w:after="0" w:line="252" w:lineRule="auto"/>
+              <w:jc w:val="center"/>
+            </w:pPr>
+            <w:r>
+              <w:rPr>
+                <w:rFonts w:ascii="Microsoft YaHei" w:hAnsi="Microsoft YaHei" w:eastAsia="Microsoft YaHei"/>
+                <w:color w:val="000000"/>
+                <w:sz w:val="17"/>
+              </w:rPr>
+              <w:t>R-NX-09</w:t>
+            </w:r>
+          </w:p>
+        </w:tc>
+        <w:tc>
+          <w:tcPr>
+            <w:tcW w:type="dxa" w:w="4229"/>
+            <w:vAlign w:val="center"/>
+            <w:tcMar>
+              <w:top w:w="38" w:type="dxa"/>
+              <w:start w:w="70" w:type="dxa"/>
+              <w:bottom w:w="38" w:type="dxa"/>
+              <w:end w:w="70" w:type="dxa"/>
+            </w:tcMar>
+            <w:tcBorders>
+              <w:top w:val="single" w:sz="6" w:space="0" w:color="D9D9D9"/>
+              <w:left w:val="single" w:sz="6" w:space="0" w:color="D9D9D9"/>
+              <w:bottom w:val="single" w:sz="6" w:space="0" w:color="D9D9D9"/>
+              <w:right w:val="single" w:sz="6" w:space="0" w:color="D9D9D9"/>
+              <w:insideH w:val="single" w:sz="6" w:space="0" w:color="D9D9D9"/>
+              <w:insideV w:val="single" w:sz="6" w:space="0" w:color="D9D9D9"/>
+            </w:tcBorders>
+            <w:shd w:fill="F3F7FA"/>
+          </w:tcPr>
+          <w:p>
+            <w:pPr>
+              <w:spacing w:after="0" w:line="252" w:lineRule="auto"/>
+              <w:jc w:val="left"/>
+            </w:pPr>
+            <w:r>
+              <w:rPr>
+                <w:rFonts w:ascii="Microsoft YaHei" w:hAnsi="Microsoft YaHei" w:eastAsia="Microsoft YaHei"/>
+                <w:color w:val="000000"/>
+                <w:sz w:val="17"/>
+              </w:rPr>
+              <w:t>本地官方源码部署完整 Skill 问答（</w:t>
+            </w:r>
+            <w:r>
+              <w:rPr>
+                <w:rFonts w:ascii="Microsoft YaHei" w:hAnsi="Microsoft YaHei" w:eastAsia="Microsoft YaHei"/>
+                <w:b/>
+                <w:color w:val="000000"/>
+                <w:sz w:val="17"/>
+              </w:rPr>
+              <w:t>不是华为托管平台验收</w:t>
+            </w:r>
+            <w:r>
+              <w:rPr>
+                <w:rFonts w:ascii="Microsoft YaHei" w:hAnsi="Microsoft YaHei" w:eastAsia="Microsoft YaHei"/>
+                <w:color w:val="000000"/>
+                <w:sz w:val="17"/>
+              </w:rPr>
+              <w:t xml:space="preserve">）：Agent 发布版本 4、DeepSeek </w:t>
+            </w:r>
+            <w:r>
+              <w:rPr>
+                <w:rFonts w:ascii="Consolas" w:hAnsi="Consolas" w:eastAsia="Microsoft YaHei"/>
+                <w:color w:val="000000"/>
+                <w:sz w:val="16"/>
+              </w:rPr>
+              <w:t>deepseek-v4-pro</w:t>
+            </w:r>
+            <w:r>
+              <w:rPr>
+                <w:rFonts w:ascii="Microsoft YaHei" w:hAnsi="Microsoft YaHei" w:eastAsia="Microsoft YaHei"/>
+                <w:color w:val="000000"/>
+                <w:sz w:val="17"/>
+              </w:rPr>
+              <w:t>、21 MCP 只读工具 + 5 Skill 绑定、HTTP 200、8 步、31 次调用、13 个唯一工具、2,777 字回答</w:t>
+            </w:r>
+          </w:p>
+        </w:tc>
+        <w:tc>
+          <w:tcPr>
+            <w:tcW w:type="dxa" w:w="4612"/>
+            <w:vAlign w:val="center"/>
+            <w:tcMar>
+              <w:top w:w="38" w:type="dxa"/>
+              <w:start w:w="70" w:type="dxa"/>
+              <w:bottom w:w="38" w:type="dxa"/>
+              <w:end w:w="70" w:type="dxa"/>
+            </w:tcMar>
+            <w:tcBorders>
+              <w:top w:val="single" w:sz="6" w:space="0" w:color="D9D9D9"/>
+              <w:left w:val="single" w:sz="6" w:space="0" w:color="D9D9D9"/>
+              <w:bottom w:val="single" w:sz="6" w:space="0" w:color="D9D9D9"/>
+              <w:right w:val="single" w:sz="6" w:space="0" w:color="D9D9D9"/>
+              <w:insideH w:val="single" w:sz="6" w:space="0" w:color="D9D9D9"/>
+              <w:insideV w:val="single" w:sz="6" w:space="0" w:color="D9D9D9"/>
+            </w:tcBorders>
+            <w:shd w:fill="F3F7FA"/>
+          </w:tcPr>
+          <w:p>
+            <w:pPr>
+              <w:spacing w:after="0" w:line="252" w:lineRule="auto"/>
+              <w:jc w:val="left"/>
+            </w:pPr>
+            <w:r>
+              <w:rPr>
+                <w:rFonts w:ascii="Consolas" w:hAnsi="Consolas" w:eastAsia="Microsoft YaHei"/>
+                <w:color w:val="000000"/>
+                <w:sz w:val="16"/>
+              </w:rPr>
+              <w:t>artifacts/nexent-platform-acceptance/recheck-2026-09-30-llm-qa.yaml</w:t>
+            </w:r>
+            <w:r>
+              <w:rPr>
+                <w:rFonts w:ascii="Microsoft YaHei" w:hAnsi="Microsoft YaHei" w:eastAsia="Microsoft YaHei"/>
+                <w:color w:val="000000"/>
+                <w:sz w:val="17"/>
+              </w:rPr>
+              <w:t xml:space="preserve"> + </w:t>
+            </w:r>
+            <w:r>
+              <w:rPr>
+                <w:rFonts w:ascii="Consolas" w:hAnsi="Consolas" w:eastAsia="Microsoft YaHei"/>
+                <w:color w:val="000000"/>
+                <w:sz w:val="16"/>
+              </w:rPr>
+              <w:t>evidence/llm-qa-2026-09-30/</w:t>
+            </w:r>
+          </w:p>
+        </w:tc>
+      </w:tr>
+      <w:tr>
+        <w:trPr>
+          <w:cantSplit w:val="true"/>
+        </w:trPr>
+        <w:tc>
+          <w:tcPr>
+            <w:tcW w:type="dxa" w:w="1152"/>
+            <w:vAlign w:val="center"/>
+            <w:tcMar>
+              <w:top w:w="38" w:type="dxa"/>
+              <w:start w:w="70" w:type="dxa"/>
+              <w:bottom w:w="38" w:type="dxa"/>
+              <w:end w:w="70" w:type="dxa"/>
+            </w:tcMar>
+            <w:tcBorders>
+              <w:top w:val="single" w:sz="6" w:space="0" w:color="D9D9D9"/>
+              <w:left w:val="single" w:sz="6" w:space="0" w:color="D9D9D9"/>
+              <w:bottom w:val="single" w:sz="6" w:space="0" w:color="D9D9D9"/>
+              <w:right w:val="single" w:sz="6" w:space="0" w:color="D9D9D9"/>
+              <w:insideH w:val="single" w:sz="6" w:space="0" w:color="D9D9D9"/>
+              <w:insideV w:val="single" w:sz="6" w:space="0" w:color="D9D9D9"/>
+            </w:tcBorders>
           </w:tcPr>
           <w:p>
             <w:pPr>
@@ -6929,7 +7835,6 @@
               <w:insideH w:val="single" w:sz="6" w:space="0" w:color="D9D9D9"/>
               <w:insideV w:val="single" w:sz="6" w:space="0" w:color="D9D9D9"/>
             </w:tcBorders>
-            <w:shd w:fill="F3F7FA"/>
           </w:tcPr>
           <w:p>
             <w:pPr>
@@ -6964,7 +7869,6 @@
               <w:insideH w:val="single" w:sz="6" w:space="0" w:color="D9D9D9"/>
               <w:insideV w:val="single" w:sz="6" w:space="0" w:color="D9D9D9"/>
             </w:tcBorders>
-            <w:shd w:fill="F3F7FA"/>
           </w:tcPr>
           <w:p>
             <w:pPr>
@@ -7004,6 +7908,7 @@
               <w:insideH w:val="single" w:sz="6" w:space="0" w:color="D9D9D9"/>
               <w:insideV w:val="single" w:sz="6" w:space="0" w:color="D9D9D9"/>
             </w:tcBorders>
+            <w:shd w:fill="F3F7FA"/>
           </w:tcPr>
           <w:p>
             <w:pPr>
@@ -7038,6 +7943,7 @@
               <w:insideH w:val="single" w:sz="6" w:space="0" w:color="D9D9D9"/>
               <w:insideV w:val="single" w:sz="6" w:space="0" w:color="D9D9D9"/>
             </w:tcBorders>
+            <w:shd w:fill="F3F7FA"/>
           </w:tcPr>
           <w:p>
             <w:pPr>
@@ -7072,6 +7978,7 @@
               <w:insideH w:val="single" w:sz="6" w:space="0" w:color="D9D9D9"/>
               <w:insideV w:val="single" w:sz="6" w:space="0" w:color="D9D9D9"/>
             </w:tcBorders>
+            <w:shd w:fill="F3F7FA"/>
           </w:tcPr>
           <w:p>
             <w:pPr>
@@ -7111,7 +8018,6 @@
               <w:insideH w:val="single" w:sz="6" w:space="0" w:color="D9D9D9"/>
               <w:insideV w:val="single" w:sz="6" w:space="0" w:color="D9D9D9"/>
             </w:tcBorders>
-            <w:shd w:fill="F3F7FA"/>
           </w:tcPr>
           <w:p>
             <w:pPr>
@@ -7146,7 +8052,6 @@
               <w:insideH w:val="single" w:sz="6" w:space="0" w:color="D9D9D9"/>
               <w:insideV w:val="single" w:sz="6" w:space="0" w:color="D9D9D9"/>
             </w:tcBorders>
-            <w:shd w:fill="F3F7FA"/>
           </w:tcPr>
           <w:p>
             <w:pPr>
@@ -7181,7 +8086,6 @@
               <w:insideH w:val="single" w:sz="6" w:space="0" w:color="D9D9D9"/>
               <w:insideV w:val="single" w:sz="6" w:space="0" w:color="D9D9D9"/>
             </w:tcBorders>
-            <w:shd w:fill="F3F7FA"/>
           </w:tcPr>
           <w:p>
             <w:pPr>
@@ -7221,6 +8125,7 @@
               <w:insideH w:val="single" w:sz="6" w:space="0" w:color="D9D9D9"/>
               <w:insideV w:val="single" w:sz="6" w:space="0" w:color="D9D9D9"/>
             </w:tcBorders>
+            <w:shd w:fill="F3F7FA"/>
           </w:tcPr>
           <w:p>
             <w:pPr>
@@ -7255,6 +8160,7 @@
               <w:insideH w:val="single" w:sz="6" w:space="0" w:color="D9D9D9"/>
               <w:insideV w:val="single" w:sz="6" w:space="0" w:color="D9D9D9"/>
             </w:tcBorders>
+            <w:shd w:fill="F3F7FA"/>
           </w:tcPr>
           <w:p>
             <w:pPr>
@@ -7289,6 +8195,7 @@
               <w:insideH w:val="single" w:sz="6" w:space="0" w:color="D9D9D9"/>
               <w:insideV w:val="single" w:sz="6" w:space="0" w:color="D9D9D9"/>
             </w:tcBorders>
+            <w:shd w:fill="F3F7FA"/>
           </w:tcPr>
           <w:p>
             <w:pPr>
@@ -7328,7 +8235,6 @@
               <w:insideH w:val="single" w:sz="6" w:space="0" w:color="D9D9D9"/>
               <w:insideV w:val="single" w:sz="6" w:space="0" w:color="D9D9D9"/>
             </w:tcBorders>
-            <w:shd w:fill="F3F7FA"/>
           </w:tcPr>
           <w:p>
             <w:pPr>
@@ -7363,7 +8269,6 @@
               <w:insideH w:val="single" w:sz="6" w:space="0" w:color="D9D9D9"/>
               <w:insideV w:val="single" w:sz="6" w:space="0" w:color="D9D9D9"/>
             </w:tcBorders>
-            <w:shd w:fill="F3F7FA"/>
           </w:tcPr>
           <w:p>
             <w:pPr>
@@ -7398,7 +8303,6 @@
               <w:insideH w:val="single" w:sz="6" w:space="0" w:color="D9D9D9"/>
               <w:insideV w:val="single" w:sz="6" w:space="0" w:color="D9D9D9"/>
             </w:tcBorders>
-            <w:shd w:fill="F3F7FA"/>
           </w:tcPr>
           <w:p>
             <w:pPr>
@@ -7438,6 +8342,7 @@
               <w:insideH w:val="single" w:sz="6" w:space="0" w:color="D9D9D9"/>
               <w:insideV w:val="single" w:sz="6" w:space="0" w:color="D9D9D9"/>
             </w:tcBorders>
+            <w:shd w:fill="F3F7FA"/>
           </w:tcPr>
           <w:p>
             <w:pPr>
@@ -7472,6 +8377,7 @@
               <w:insideH w:val="single" w:sz="6" w:space="0" w:color="D9D9D9"/>
               <w:insideV w:val="single" w:sz="6" w:space="0" w:color="D9D9D9"/>
             </w:tcBorders>
+            <w:shd w:fill="F3F7FA"/>
           </w:tcPr>
           <w:p>
             <w:pPr>
@@ -7506,6 +8412,7 @@
               <w:insideH w:val="single" w:sz="6" w:space="0" w:color="D9D9D9"/>
               <w:insideV w:val="single" w:sz="6" w:space="0" w:color="D9D9D9"/>
             </w:tcBorders>
+            <w:shd w:fill="F3F7FA"/>
           </w:tcPr>
           <w:p>
             <w:pPr>
@@ -7535,7 +8442,36 @@
           <w:rFonts w:ascii="Microsoft YaHei" w:hAnsi="Microsoft YaHei" w:eastAsia="Microsoft YaHei"/>
           <w:sz w:val="21"/>
         </w:rPr>
-        <w:t>口径：以上均为软件内部 E1/E2 证据、本地平台侧验收与华为托管平台 MCP 注册/ 公网端点调用记录，不代表真实海域部署验证，不代表感知精度，也不代表托管平台 已完整跑通 Skill 问答。</w:t>
+        <w:t>口径：以上均为软件内部 E1/E2 证据、本地平台侧验收，以及华为托管平台 MCP 注册 / 公网端点调用 / Agent 创建记录。R-NX-09 证明的是</w:t>
+      </w:r>
+      <w:r>
+        <w:rPr>
+          <w:rFonts w:ascii="Microsoft YaHei" w:hAnsi="Microsoft YaHei" w:eastAsia="Microsoft YaHei"/>
+          <w:b/>
+          <w:sz w:val="21"/>
+        </w:rPr>
+        <w:t>本地官方源码 部署</w:t>
+      </w:r>
+      <w:r>
+        <w:rPr>
+          <w:rFonts w:ascii="Microsoft YaHei" w:hAnsi="Microsoft YaHei" w:eastAsia="Microsoft YaHei"/>
+          <w:sz w:val="21"/>
+        </w:rPr>
+        <w:t xml:space="preserve">内的完整 LLM Skill 问答；华为托管平台内完整 Skill 问答仍为 R-NX-07 </w:t>
+      </w:r>
+      <w:r>
+        <w:rPr>
+          <w:rFonts w:ascii="Consolas" w:hAnsi="Consolas" w:eastAsia="Microsoft YaHei"/>
+          <w:sz w:val="20"/>
+        </w:rPr>
+        <w:t>blocked</w:t>
+      </w:r>
+      <w:r>
+        <w:rPr>
+          <w:rFonts w:ascii="Microsoft YaHei" w:hAnsi="Microsoft YaHei" w:eastAsia="Microsoft YaHei"/>
+          <w:sz w:val="21"/>
+        </w:rPr>
+        <w:t>，不得写成“托管平台已验收”。以上记录均不代表真实海域 部署验证，也不代表感知精度。</w:t>
       </w:r>
     </w:p>
     <w:p>
@@ -8480,7 +9416,7 @@
           <w:rFonts w:ascii="Microsoft YaHei" w:hAnsi="Microsoft YaHei" w:eastAsia="Microsoft YaHei"/>
           <w:sz w:val="21"/>
         </w:rPr>
-        <w:t>版本管理：模板目录随仓库 git 冻结；Agent 配置与绑定 Skills 导出 ZIP 已登记 R-NX-04；华为托管平台 MCP 注册已登记 R-NX-05。发布流程为：模板修改 → SKILL.md 评审 → Nexent 导入 → 示例问答验证 → 导出配置并存档。</w:t>
+        <w:t>版本管理：模板目录随仓库 git 冻结；Agent 配置与绑定 Skills 导出 ZIP 已登记 R-NX-04，本地完整问答与发布版本 4 已登记 R-NX-09；华为托管平台 MCP 注册已登记 R-NX-05，5 个 Skill 导入已登记 R-NX-07。发布流程为：模板修改 → SKILL.md 评审 → Nexent 导入 → 示例问答验证 → 导出配置并存档。</w:t>
       </w:r>
     </w:p>
     <w:p>
@@ -10221,18 +11157,33 @@
       <w:r>
         <w:rPr>
           <w:rFonts w:ascii="Microsoft YaHei" w:hAnsi="Microsoft YaHei" w:eastAsia="Microsoft YaHei"/>
+          <w:b/>
           <w:sz w:val="21"/>
         </w:rPr>
-        <w:t>决赛阶段用一卡华为云算力代金券部署 MCP 服务；托管平台 MCP 注册已完成</w:t>
-      </w:r>
-    </w:p>
-    <w:p>
+        <w:t>本地完整问答已闭环</w:t>
+      </w:r>
       <w:r>
         <w:rPr>
           <w:rFonts w:ascii="Microsoft YaHei" w:hAnsi="Microsoft YaHei" w:eastAsia="Microsoft YaHei"/>
           <w:sz w:val="21"/>
         </w:rPr>
-        <w:t>（R-NX-05），Agent 创建与 DeepSeek 模型配置已完成（R-NX-06），决赛阶段 用于完整 Skill 问答与多行业迁移演示；</w:t>
+        <w:t>：本地官方源码部署的 nexent v2.6.1 + DeepSeek</w:t>
+      </w:r>
+    </w:p>
+    <w:p>
+      <w:r>
+        <w:rPr>
+          <w:rFonts w:ascii="Consolas" w:hAnsi="Consolas" w:eastAsia="Microsoft YaHei"/>
+          <w:sz w:val="20"/>
+        </w:rPr>
+        <w:t>deepseek-v4-pro</w:t>
+      </w:r>
+      <w:r>
+        <w:rPr>
+          <w:rFonts w:ascii="Microsoft YaHei" w:hAnsi="Microsoft YaHei" w:eastAsia="Microsoft YaHei"/>
+          <w:sz w:val="21"/>
+        </w:rPr>
+        <w:t xml:space="preserve"> 已跑通 21 工具 / 5 Skill 的完整问答（R-NX-09）， 证据链、SSE 事件、工具轨迹与控制台截图均已落盘，可作为初赛“智能体 可运行 + 示例问答”的已验收材料。</w:t>
       </w:r>
     </w:p>
     <w:p>
@@ -10243,18 +11194,68 @@
       <w:r>
         <w:rPr>
           <w:rFonts w:ascii="Microsoft YaHei" w:hAnsi="Microsoft YaHei" w:eastAsia="Microsoft YaHei"/>
+          <w:b/>
           <w:sz w:val="21"/>
         </w:rPr>
-        <w:t>托管平台公网环境不支持 Skill（平台 UI 明确提示），完整 Skill 问答需</w:t>
-      </w:r>
-    </w:p>
-    <w:p>
+        <w:t>托管平台完整问答仍未跑通</w:t>
+      </w:r>
       <w:r>
         <w:rPr>
           <w:rFonts w:ascii="Microsoft YaHei" w:hAnsi="Microsoft YaHei" w:eastAsia="Microsoft YaHei"/>
           <w:sz w:val="21"/>
         </w:rPr>
-        <w:t>私网环境 + 私网可访问 MCP endpoint 后验收；完成前不写“托管平台已跑通 完整 Skill 问答”；</w:t>
+        <w:t>：托管平台 MCP 注册（R-NX-05）与 Agent</w:t>
+      </w:r>
+    </w:p>
+    <w:p>
+      <w:r>
+        <w:rPr>
+          <w:rFonts w:ascii="Microsoft YaHei" w:hAnsi="Microsoft YaHei" w:eastAsia="Microsoft YaHei"/>
+          <w:sz w:val="21"/>
+        </w:rPr>
+        <w:t xml:space="preserve">创建/模型配置（R-NX-06）已完成，但公网环境不支持 Skill；切私网后 因华为云账号欠费“创建 Target”原生 disabled（0/10，R-NX-07 </w:t>
+      </w:r>
+      <w:r>
+        <w:rPr>
+          <w:rFonts w:ascii="Consolas" w:hAnsi="Consolas" w:eastAsia="Microsoft YaHei"/>
+          <w:sz w:val="20"/>
+        </w:rPr>
+        <w:t>blocked</w:t>
+      </w:r>
+      <w:r>
+        <w:rPr>
+          <w:rFonts w:ascii="Microsoft YaHei" w:hAnsi="Microsoft YaHei" w:eastAsia="Microsoft YaHei"/>
+          <w:sz w:val="21"/>
+        </w:rPr>
+        <w:t xml:space="preserve">），Agent 启用 VPC 时报 </w:t>
+      </w:r>
+      <w:r>
+        <w:rPr>
+          <w:rFonts w:ascii="Consolas" w:hAnsi="Consolas" w:eastAsia="Microsoft YaHei"/>
+          <w:sz w:val="20"/>
+        </w:rPr>
+        <w:t>AgentArts.03002206</w:t>
+      </w:r>
+      <w:r>
+        <w:rPr>
+          <w:rFonts w:ascii="Microsoft YaHei" w:hAnsi="Microsoft YaHei" w:eastAsia="Microsoft YaHei"/>
+          <w:sz w:val="21"/>
+        </w:rPr>
+        <w:t xml:space="preserve">。充值后可执行 </w:t>
+      </w:r>
+      <w:r>
+        <w:rPr>
+          <w:rFonts w:ascii="Consolas" w:hAnsi="Consolas" w:eastAsia="Microsoft YaHei"/>
+          <w:sz w:val="20"/>
+        </w:rPr>
+        <w:t>docs/competitions/huawei-agentarts-vpc-target-runbook.md</w:t>
+      </w:r>
+      <w:r>
+        <w:rPr>
+          <w:rFonts w:ascii="Microsoft YaHei" w:hAnsi="Microsoft YaHei" w:eastAsia="Microsoft YaHei"/>
+          <w:sz w:val="21"/>
+        </w:rPr>
+        <w:t>，创建 Target → 绑定 VPC 网络模式 → 发布新版本 → 平台内完整 Skill 问答，完成后登记 R-NX-08。完成前不写“托管平台已跑通完整 Skill 问答”。</w:t>
       </w:r>
     </w:p>
     <w:p>
@@ -10267,7 +11268,7 @@
           <w:rFonts w:ascii="Microsoft YaHei" w:hAnsi="Microsoft YaHei" w:eastAsia="Microsoft YaHei"/>
           <w:sz w:val="21"/>
         </w:rPr>
-        <w:t>公开开放数据替代评测已完成（R-OD-01），但真实脱敏行业数据评测仍待数据</w:t>
+        <w:t>公开开放数据替代评测已完成（R-OD-01）；真实脱敏行业数据评测仍待数据</w:t>
       </w:r>
     </w:p>
     <w:p>
@@ -10277,19 +11278,6 @@
           <w:sz w:val="21"/>
         </w:rPr>
         <w:t>来源与脱敏规则确认后执行，不编造评测结果。</w:t>
-      </w:r>
-    </w:p>
-    <w:p>
-      <w:pPr>
-        <w:pStyle w:val="ListBullet"/>
-        <w:ind w:left="346" w:hanging="259"/>
-      </w:pPr>
-      <w:r>
-        <w:rPr>
-          <w:rFonts w:ascii="Microsoft YaHei" w:hAnsi="Microsoft YaHei" w:eastAsia="Microsoft YaHei"/>
-          <w:sz w:val="21"/>
-        </w:rPr>
-        <w:t>真实脱敏行业数据评测待数据来源与脱敏规则确认后执行，不编造评测结果。</w:t>
       </w:r>
     </w:p>
     <w:p>
@@ -10519,7 +11507,65 @@
           <w:rFonts w:ascii="Microsoft YaHei" w:hAnsi="Microsoft YaHei" w:eastAsia="Microsoft YaHei"/>
           <w:sz w:val="21"/>
         </w:rPr>
-        <w:t>调用与 Agent 创建/模型配置证据；托管平台完整 Skill 问答未跑通（公网 环境不支持 Skill），不写成“托管平台完整 Skill 问答已通过”。</w:t>
+        <w:t xml:space="preserve">调用与 Agent 创建/模型配置证据；R-NX-07 记录托管平台完整 Skill 问答因 账号欠费、私网 Target 未绑定（0/10）而 </w:t>
+      </w:r>
+      <w:r>
+        <w:rPr>
+          <w:rFonts w:ascii="Consolas" w:hAnsi="Consolas" w:eastAsia="Microsoft YaHei"/>
+          <w:sz w:val="20"/>
+        </w:rPr>
+        <w:t>blocked</w:t>
+      </w:r>
+      <w:r>
+        <w:rPr>
+          <w:rFonts w:ascii="Microsoft YaHei" w:hAnsi="Microsoft YaHei" w:eastAsia="Microsoft YaHei"/>
+          <w:sz w:val="21"/>
+        </w:rPr>
+        <w:t>，不写成“托管平台完整 Skill 问答已通过”。</w:t>
+      </w:r>
+    </w:p>
+    <w:p>
+      <w:pPr>
+        <w:spacing w:after="40" w:line="274" w:lineRule="auto"/>
+        <w:ind w:left="403" w:hanging="317"/>
+      </w:pPr>
+      <w:r>
+        <w:rPr>
+          <w:rFonts w:ascii="Microsoft YaHei" w:hAnsi="Microsoft YaHei" w:eastAsia="Microsoft YaHei"/>
+          <w:sz w:val="21"/>
+        </w:rPr>
+        <w:t xml:space="preserve">10. </w:t>
+      </w:r>
+      <w:r>
+        <w:rPr>
+          <w:rFonts w:ascii="Microsoft YaHei" w:hAnsi="Microsoft YaHei" w:eastAsia="Microsoft YaHei"/>
+          <w:sz w:val="21"/>
+        </w:rPr>
+        <w:t>R-NX-09 是</w:t>
+      </w:r>
+      <w:r>
+        <w:rPr>
+          <w:rFonts w:ascii="Microsoft YaHei" w:hAnsi="Microsoft YaHei" w:eastAsia="Microsoft YaHei"/>
+          <w:b/>
+          <w:sz w:val="21"/>
+        </w:rPr>
+        <w:t>本地官方源码部署</w:t>
+      </w:r>
+      <w:r>
+        <w:rPr>
+          <w:rFonts w:ascii="Microsoft YaHei" w:hAnsi="Microsoft YaHei" w:eastAsia="Microsoft YaHei"/>
+          <w:sz w:val="21"/>
+        </w:rPr>
+        <w:t xml:space="preserve"> Nexent 的完整 LLM Skill 问答，可以写</w:t>
+      </w:r>
+    </w:p>
+    <w:p>
+      <w:r>
+        <w:rPr>
+          <w:rFonts w:ascii="Microsoft YaHei" w:hAnsi="Microsoft YaHei" w:eastAsia="Microsoft YaHei"/>
+          <w:sz w:val="21"/>
+        </w:rPr>
+        <w:t>“本地 Nexent 完整 Skill 问答已跑通”，不得写成“华为托管平台已跑通” 或“华为 AgentArts 平台验收通过”；它也不构成海域验证或精度证据。</w:t>
       </w:r>
     </w:p>
     <w:p>
@@ -11398,6 +12444,438 @@
               <w:insideH w:val="single" w:sz="6" w:space="0" w:color="D9D9D9"/>
               <w:insideV w:val="single" w:sz="6" w:space="0" w:color="D9D9D9"/>
             </w:tcBorders>
+          </w:tcPr>
+          <w:p>
+            <w:pPr>
+              <w:spacing w:after="0" w:line="252" w:lineRule="auto"/>
+              <w:jc w:val="left"/>
+            </w:pPr>
+            <w:r>
+              <w:rPr>
+                <w:rFonts w:ascii="Microsoft YaHei" w:hAnsi="Microsoft YaHei" w:eastAsia="Microsoft YaHei"/>
+                <w:color w:val="000000"/>
+                <w:sz w:val="17"/>
+              </w:rPr>
+              <w:t>liyongxiang + WP-15</w:t>
+            </w:r>
+          </w:p>
+        </w:tc>
+      </w:tr>
+      <w:tr>
+        <w:trPr>
+          <w:cantSplit w:val="true"/>
+        </w:trPr>
+        <w:tc>
+          <w:tcPr>
+            <w:tcW w:type="dxa" w:w="1753"/>
+            <w:vAlign w:val="center"/>
+            <w:tcMar>
+              <w:top w:w="38" w:type="dxa"/>
+              <w:start w:w="70" w:type="dxa"/>
+              <w:bottom w:w="38" w:type="dxa"/>
+              <w:end w:w="70" w:type="dxa"/>
+            </w:tcMar>
+            <w:tcBorders>
+              <w:top w:val="single" w:sz="6" w:space="0" w:color="D9D9D9"/>
+              <w:left w:val="single" w:sz="6" w:space="0" w:color="D9D9D9"/>
+              <w:bottom w:val="single" w:sz="6" w:space="0" w:color="D9D9D9"/>
+              <w:right w:val="single" w:sz="6" w:space="0" w:color="D9D9D9"/>
+              <w:insideH w:val="single" w:sz="6" w:space="0" w:color="D9D9D9"/>
+              <w:insideV w:val="single" w:sz="6" w:space="0" w:color="D9D9D9"/>
+            </w:tcBorders>
+            <w:shd w:fill="F3F7FA"/>
+          </w:tcPr>
+          <w:p>
+            <w:pPr>
+              <w:spacing w:after="0" w:line="252" w:lineRule="auto"/>
+              <w:jc w:val="left"/>
+            </w:pPr>
+            <w:r>
+              <w:rPr>
+                <w:rFonts w:ascii="Microsoft YaHei" w:hAnsi="Microsoft YaHei" w:eastAsia="Microsoft YaHei"/>
+                <w:color w:val="000000"/>
+                <w:sz w:val="17"/>
+              </w:rPr>
+              <w:t>2026-09-30</w:t>
+            </w:r>
+          </w:p>
+        </w:tc>
+        <w:tc>
+          <w:tcPr>
+            <w:tcW w:type="dxa" w:w="7088"/>
+            <w:vAlign w:val="center"/>
+            <w:tcMar>
+              <w:top w:w="38" w:type="dxa"/>
+              <w:start w:w="70" w:type="dxa"/>
+              <w:bottom w:w="38" w:type="dxa"/>
+              <w:end w:w="70" w:type="dxa"/>
+            </w:tcMar>
+            <w:tcBorders>
+              <w:top w:val="single" w:sz="6" w:space="0" w:color="D9D9D9"/>
+              <w:left w:val="single" w:sz="6" w:space="0" w:color="D9D9D9"/>
+              <w:bottom w:val="single" w:sz="6" w:space="0" w:color="D9D9D9"/>
+              <w:right w:val="single" w:sz="6" w:space="0" w:color="D9D9D9"/>
+              <w:insideH w:val="single" w:sz="6" w:space="0" w:color="D9D9D9"/>
+              <w:insideV w:val="single" w:sz="6" w:space="0" w:color="D9D9D9"/>
+            </w:tcBorders>
+            <w:shd w:fill="F3F7FA"/>
+          </w:tcPr>
+          <w:p>
+            <w:pPr>
+              <w:spacing w:after="0" w:line="252" w:lineRule="auto"/>
+              <w:jc w:val="left"/>
+            </w:pPr>
+            <w:r>
+              <w:rPr>
+                <w:rFonts w:ascii="Microsoft YaHei" w:hAnsi="Microsoft YaHei" w:eastAsia="Microsoft YaHei"/>
+                <w:color w:val="000000"/>
+                <w:sz w:val="17"/>
+              </w:rPr>
+              <w:t>登记 R-NX-03B 本地 MCP 端点复验（</w:t>
+            </w:r>
+            <w:r>
+              <w:rPr>
+                <w:rFonts w:ascii="Consolas" w:hAnsi="Consolas" w:eastAsia="Microsoft YaHei"/>
+                <w:color w:val="000000"/>
+                <w:sz w:val="16"/>
+              </w:rPr>
+              <w:t>mcp 1.30.0</w:t>
+            </w:r>
+            <w:r>
+              <w:rPr>
+                <w:rFonts w:ascii="Microsoft YaHei" w:hAnsi="Microsoft YaHei" w:eastAsia="Microsoft YaHei"/>
+                <w:color w:val="000000"/>
+                <w:sz w:val="17"/>
+              </w:rPr>
+              <w:t xml:space="preserve"> / 协议 </w:t>
+            </w:r>
+            <w:r>
+              <w:rPr>
+                <w:rFonts w:ascii="Consolas" w:hAnsi="Consolas" w:eastAsia="Microsoft YaHei"/>
+                <w:color w:val="000000"/>
+                <w:sz w:val="16"/>
+              </w:rPr>
+              <w:t>2025-11-25</w:t>
+            </w:r>
+            <w:r>
+              <w:rPr>
+                <w:rFonts w:ascii="Microsoft YaHei" w:hAnsi="Microsoft YaHei" w:eastAsia="Microsoft YaHei"/>
+                <w:color w:val="000000"/>
+                <w:sz w:val="17"/>
+              </w:rPr>
+              <w:t>，21 工具、3 次只读调用）</w:t>
+            </w:r>
+          </w:p>
+        </w:tc>
+        <w:tc>
+          <w:tcPr>
+            <w:tcW w:type="dxa" w:w="1152"/>
+            <w:vAlign w:val="center"/>
+            <w:tcMar>
+              <w:top w:w="38" w:type="dxa"/>
+              <w:start w:w="70" w:type="dxa"/>
+              <w:bottom w:w="38" w:type="dxa"/>
+              <w:end w:w="70" w:type="dxa"/>
+            </w:tcMar>
+            <w:tcBorders>
+              <w:top w:val="single" w:sz="6" w:space="0" w:color="D9D9D9"/>
+              <w:left w:val="single" w:sz="6" w:space="0" w:color="D9D9D9"/>
+              <w:bottom w:val="single" w:sz="6" w:space="0" w:color="D9D9D9"/>
+              <w:right w:val="single" w:sz="6" w:space="0" w:color="D9D9D9"/>
+              <w:insideH w:val="single" w:sz="6" w:space="0" w:color="D9D9D9"/>
+              <w:insideV w:val="single" w:sz="6" w:space="0" w:color="D9D9D9"/>
+            </w:tcBorders>
+            <w:shd w:fill="F3F7FA"/>
+          </w:tcPr>
+          <w:p>
+            <w:pPr>
+              <w:spacing w:after="0" w:line="252" w:lineRule="auto"/>
+              <w:jc w:val="center"/>
+            </w:pPr>
+            <w:r>
+              <w:rPr>
+                <w:rFonts w:ascii="Microsoft YaHei" w:hAnsi="Microsoft YaHei" w:eastAsia="Microsoft YaHei"/>
+                <w:color w:val="000000"/>
+                <w:sz w:val="17"/>
+              </w:rPr>
+              <w:t>WP-15</w:t>
+            </w:r>
+          </w:p>
+        </w:tc>
+      </w:tr>
+      <w:tr>
+        <w:trPr>
+          <w:cantSplit w:val="true"/>
+        </w:trPr>
+        <w:tc>
+          <w:tcPr>
+            <w:tcW w:type="dxa" w:w="1753"/>
+            <w:vAlign w:val="center"/>
+            <w:tcMar>
+              <w:top w:w="38" w:type="dxa"/>
+              <w:start w:w="70" w:type="dxa"/>
+              <w:bottom w:w="38" w:type="dxa"/>
+              <w:end w:w="70" w:type="dxa"/>
+            </w:tcMar>
+            <w:tcBorders>
+              <w:top w:val="single" w:sz="6" w:space="0" w:color="D9D9D9"/>
+              <w:left w:val="single" w:sz="6" w:space="0" w:color="D9D9D9"/>
+              <w:bottom w:val="single" w:sz="6" w:space="0" w:color="D9D9D9"/>
+              <w:right w:val="single" w:sz="6" w:space="0" w:color="D9D9D9"/>
+              <w:insideH w:val="single" w:sz="6" w:space="0" w:color="D9D9D9"/>
+              <w:insideV w:val="single" w:sz="6" w:space="0" w:color="D9D9D9"/>
+            </w:tcBorders>
+          </w:tcPr>
+          <w:p>
+            <w:pPr>
+              <w:spacing w:after="0" w:line="252" w:lineRule="auto"/>
+              <w:jc w:val="left"/>
+            </w:pPr>
+            <w:r>
+              <w:rPr>
+                <w:rFonts w:ascii="Microsoft YaHei" w:hAnsi="Microsoft YaHei" w:eastAsia="Microsoft YaHei"/>
+                <w:color w:val="000000"/>
+                <w:sz w:val="17"/>
+              </w:rPr>
+              <w:t>2026-09-30</w:t>
+            </w:r>
+          </w:p>
+        </w:tc>
+        <w:tc>
+          <w:tcPr>
+            <w:tcW w:type="dxa" w:w="7088"/>
+            <w:vAlign w:val="center"/>
+            <w:tcMar>
+              <w:top w:w="38" w:type="dxa"/>
+              <w:start w:w="70" w:type="dxa"/>
+              <w:bottom w:w="38" w:type="dxa"/>
+              <w:end w:w="70" w:type="dxa"/>
+            </w:tcMar>
+            <w:tcBorders>
+              <w:top w:val="single" w:sz="6" w:space="0" w:color="D9D9D9"/>
+              <w:left w:val="single" w:sz="6" w:space="0" w:color="D9D9D9"/>
+              <w:bottom w:val="single" w:sz="6" w:space="0" w:color="D9D9D9"/>
+              <w:right w:val="single" w:sz="6" w:space="0" w:color="D9D9D9"/>
+              <w:insideH w:val="single" w:sz="6" w:space="0" w:color="D9D9D9"/>
+              <w:insideV w:val="single" w:sz="6" w:space="0" w:color="D9D9D9"/>
+            </w:tcBorders>
+          </w:tcPr>
+          <w:p>
+            <w:pPr>
+              <w:spacing w:after="0" w:line="252" w:lineRule="auto"/>
+              <w:jc w:val="left"/>
+            </w:pPr>
+            <w:r>
+              <w:rPr>
+                <w:rFonts w:ascii="Microsoft YaHei" w:hAnsi="Microsoft YaHei" w:eastAsia="Microsoft YaHei"/>
+                <w:color w:val="000000"/>
+                <w:sz w:val="17"/>
+              </w:rPr>
+              <w:t xml:space="preserve">登记 R-NX-07 </w:t>
+            </w:r>
+            <w:r>
+              <w:rPr>
+                <w:rFonts w:ascii="Consolas" w:hAnsi="Consolas" w:eastAsia="Microsoft YaHei"/>
+                <w:color w:val="000000"/>
+                <w:sz w:val="16"/>
+              </w:rPr>
+              <w:t>blocked</w:t>
+            </w:r>
+            <w:r>
+              <w:rPr>
+                <w:rFonts w:ascii="Microsoft YaHei" w:hAnsi="Microsoft YaHei" w:eastAsia="Microsoft YaHei"/>
+                <w:color w:val="000000"/>
+                <w:sz w:val="17"/>
+              </w:rPr>
+              <w:t xml:space="preserve">：华为托管平台私网环境/网关已建，Target 因账号欠费原生 disabled（0/10），Agent 启用 VPC 报 </w:t>
+            </w:r>
+            <w:r>
+              <w:rPr>
+                <w:rFonts w:ascii="Consolas" w:hAnsi="Consolas" w:eastAsia="Microsoft YaHei"/>
+                <w:color w:val="000000"/>
+                <w:sz w:val="16"/>
+              </w:rPr>
+              <w:t>AgentArts.03002206</w:t>
+            </w:r>
+            <w:r>
+              <w:rPr>
+                <w:rFonts w:ascii="Microsoft YaHei" w:hAnsi="Microsoft YaHei" w:eastAsia="Microsoft YaHei"/>
+                <w:color w:val="000000"/>
+                <w:sz w:val="17"/>
+              </w:rPr>
+              <w:t>；新增充值后 runbook（R-NX-08 准备）</w:t>
+            </w:r>
+          </w:p>
+        </w:tc>
+        <w:tc>
+          <w:tcPr>
+            <w:tcW w:type="dxa" w:w="1152"/>
+            <w:vAlign w:val="center"/>
+            <w:tcMar>
+              <w:top w:w="38" w:type="dxa"/>
+              <w:start w:w="70" w:type="dxa"/>
+              <w:bottom w:w="38" w:type="dxa"/>
+              <w:end w:w="70" w:type="dxa"/>
+            </w:tcMar>
+            <w:tcBorders>
+              <w:top w:val="single" w:sz="6" w:space="0" w:color="D9D9D9"/>
+              <w:left w:val="single" w:sz="6" w:space="0" w:color="D9D9D9"/>
+              <w:bottom w:val="single" w:sz="6" w:space="0" w:color="D9D9D9"/>
+              <w:right w:val="single" w:sz="6" w:space="0" w:color="D9D9D9"/>
+              <w:insideH w:val="single" w:sz="6" w:space="0" w:color="D9D9D9"/>
+              <w:insideV w:val="single" w:sz="6" w:space="0" w:color="D9D9D9"/>
+            </w:tcBorders>
+          </w:tcPr>
+          <w:p>
+            <w:pPr>
+              <w:spacing w:after="0" w:line="252" w:lineRule="auto"/>
+              <w:jc w:val="left"/>
+            </w:pPr>
+            <w:r>
+              <w:rPr>
+                <w:rFonts w:ascii="Microsoft YaHei" w:hAnsi="Microsoft YaHei" w:eastAsia="Microsoft YaHei"/>
+                <w:color w:val="000000"/>
+                <w:sz w:val="17"/>
+              </w:rPr>
+              <w:t>liyongxiang + WP-15</w:t>
+            </w:r>
+          </w:p>
+        </w:tc>
+      </w:tr>
+      <w:tr>
+        <w:trPr>
+          <w:cantSplit w:val="true"/>
+        </w:trPr>
+        <w:tc>
+          <w:tcPr>
+            <w:tcW w:type="dxa" w:w="1753"/>
+            <w:vAlign w:val="center"/>
+            <w:tcMar>
+              <w:top w:w="38" w:type="dxa"/>
+              <w:start w:w="70" w:type="dxa"/>
+              <w:bottom w:w="38" w:type="dxa"/>
+              <w:end w:w="70" w:type="dxa"/>
+            </w:tcMar>
+            <w:tcBorders>
+              <w:top w:val="single" w:sz="6" w:space="0" w:color="D9D9D9"/>
+              <w:left w:val="single" w:sz="6" w:space="0" w:color="D9D9D9"/>
+              <w:bottom w:val="single" w:sz="6" w:space="0" w:color="D9D9D9"/>
+              <w:right w:val="single" w:sz="6" w:space="0" w:color="D9D9D9"/>
+              <w:insideH w:val="single" w:sz="6" w:space="0" w:color="D9D9D9"/>
+              <w:insideV w:val="single" w:sz="6" w:space="0" w:color="D9D9D9"/>
+            </w:tcBorders>
+            <w:shd w:fill="F3F7FA"/>
+          </w:tcPr>
+          <w:p>
+            <w:pPr>
+              <w:spacing w:after="0" w:line="252" w:lineRule="auto"/>
+              <w:jc w:val="left"/>
+            </w:pPr>
+            <w:r>
+              <w:rPr>
+                <w:rFonts w:ascii="Microsoft YaHei" w:hAnsi="Microsoft YaHei" w:eastAsia="Microsoft YaHei"/>
+                <w:color w:val="000000"/>
+                <w:sz w:val="17"/>
+              </w:rPr>
+              <w:t>2026-09-30</w:t>
+            </w:r>
+          </w:p>
+        </w:tc>
+        <w:tc>
+          <w:tcPr>
+            <w:tcW w:type="dxa" w:w="7088"/>
+            <w:vAlign w:val="center"/>
+            <w:tcMar>
+              <w:top w:w="38" w:type="dxa"/>
+              <w:start w:w="70" w:type="dxa"/>
+              <w:bottom w:w="38" w:type="dxa"/>
+              <w:end w:w="70" w:type="dxa"/>
+            </w:tcMar>
+            <w:tcBorders>
+              <w:top w:val="single" w:sz="6" w:space="0" w:color="D9D9D9"/>
+              <w:left w:val="single" w:sz="6" w:space="0" w:color="D9D9D9"/>
+              <w:bottom w:val="single" w:sz="6" w:space="0" w:color="D9D9D9"/>
+              <w:right w:val="single" w:sz="6" w:space="0" w:color="D9D9D9"/>
+              <w:insideH w:val="single" w:sz="6" w:space="0" w:color="D9D9D9"/>
+              <w:insideV w:val="single" w:sz="6" w:space="0" w:color="D9D9D9"/>
+            </w:tcBorders>
+            <w:shd w:fill="F3F7FA"/>
+          </w:tcPr>
+          <w:p>
+            <w:pPr>
+              <w:spacing w:after="0" w:line="252" w:lineRule="auto"/>
+              <w:jc w:val="left"/>
+            </w:pPr>
+            <w:r>
+              <w:rPr>
+                <w:rFonts w:ascii="Microsoft YaHei" w:hAnsi="Microsoft YaHei" w:eastAsia="Microsoft YaHei"/>
+                <w:color w:val="000000"/>
+                <w:sz w:val="17"/>
+              </w:rPr>
+              <w:t xml:space="preserve">登记 R-NX-09 本地官方源码部署完整 Skill 问答：Agent 版本 4 </w:t>
+            </w:r>
+            <w:r>
+              <w:rPr>
+                <w:rFonts w:ascii="Consolas" w:hAnsi="Consolas" w:eastAsia="Microsoft YaHei"/>
+                <w:color w:val="000000"/>
+                <w:sz w:val="16"/>
+              </w:rPr>
+              <w:t>v0.2.0-seasight-governance-llm</w:t>
+            </w:r>
+            <w:r>
+              <w:rPr>
+                <w:rFonts w:ascii="Microsoft YaHei" w:hAnsi="Microsoft YaHei" w:eastAsia="Microsoft YaHei"/>
+                <w:color w:val="000000"/>
+                <w:sz w:val="17"/>
+              </w:rPr>
+              <w:t xml:space="preserve"> + DeepSeek </w:t>
+            </w:r>
+            <w:r>
+              <w:rPr>
+                <w:rFonts w:ascii="Consolas" w:hAnsi="Consolas" w:eastAsia="Microsoft YaHei"/>
+                <w:color w:val="000000"/>
+                <w:sz w:val="16"/>
+              </w:rPr>
+              <w:t>deepseek-v4-pro</w:t>
+            </w:r>
+            <w:r>
+              <w:rPr>
+                <w:rFonts w:ascii="Microsoft YaHei" w:hAnsi="Microsoft YaHei" w:eastAsia="Microsoft YaHei"/>
+                <w:color w:val="000000"/>
+                <w:sz w:val="17"/>
+              </w:rPr>
+              <w:t>，21 工具 / 5 Skill，HTTP 200、8 步、31 次工具调用、2,777 字回答，含证据链与控制台截图；更新 4.1/4.4/4.7/七/8.5/九，升版 1.4。</w:t>
+            </w:r>
+            <w:r>
+              <w:rPr>
+                <w:rFonts w:ascii="Microsoft YaHei" w:hAnsi="Microsoft YaHei" w:eastAsia="Microsoft YaHei"/>
+                <w:b/>
+                <w:color w:val="000000"/>
+                <w:sz w:val="17"/>
+              </w:rPr>
+              <w:t>华为托管平台完整问答仍为 R-NX-07 blocked</w:t>
+            </w:r>
+          </w:p>
+        </w:tc>
+        <w:tc>
+          <w:tcPr>
+            <w:tcW w:type="dxa" w:w="1152"/>
+            <w:vAlign w:val="center"/>
+            <w:tcMar>
+              <w:top w:w="38" w:type="dxa"/>
+              <w:start w:w="70" w:type="dxa"/>
+              <w:bottom w:w="38" w:type="dxa"/>
+              <w:end w:w="70" w:type="dxa"/>
+            </w:tcMar>
+            <w:tcBorders>
+              <w:top w:val="single" w:sz="6" w:space="0" w:color="D9D9D9"/>
+              <w:left w:val="single" w:sz="6" w:space="0" w:color="D9D9D9"/>
+              <w:bottom w:val="single" w:sz="6" w:space="0" w:color="D9D9D9"/>
+              <w:right w:val="single" w:sz="6" w:space="0" w:color="D9D9D9"/>
+              <w:insideH w:val="single" w:sz="6" w:space="0" w:color="D9D9D9"/>
+              <w:insideV w:val="single" w:sz="6" w:space="0" w:color="D9D9D9"/>
+            </w:tcBorders>
+            <w:shd w:fill="F3F7FA"/>
           </w:tcPr>
           <w:p>
             <w:pPr>

</xml_diff>

<commit_message>
docs: add Huawei ICT track-3 agent design submission (material 2)
</commit_message>
<xml_diff>
--- a/项目文档/华为ICT赛道三_开发设计文档.docx
+++ b/项目文档/华为ICT赛道三_开发设计文档.docx
@@ -2984,6 +2984,72 @@
       </w:pPr>
       <w:r>
         <w:t>四、智能体构建方案</w:t>
+      </w:r>
+    </w:p>
+    <w:p>
+      <w:pPr>
+        <w:spacing w:before="60" w:after="140"/>
+        <w:ind w:left="317" w:right="259"/>
+      </w:pPr>
+      <w:r>
+        <w:rPr>
+          <w:rFonts w:ascii="Microsoft YaHei" w:hAnsi="Microsoft YaHei" w:eastAsia="Microsoft YaHei"/>
+          <w:i/>
+          <w:sz w:val="21"/>
+        </w:rPr>
+        <w:t>本节是开发设计文档视角的摘要。赛道三【材料 2】要求的独立《Nexent 智能体</w:t>
+      </w:r>
+    </w:p>
+    <w:p>
+      <w:pPr>
+        <w:spacing w:before="60" w:after="140"/>
+        <w:ind w:left="317" w:right="259"/>
+      </w:pPr>
+      <w:r>
+        <w:rPr>
+          <w:rFonts w:ascii="Microsoft YaHei" w:hAnsi="Microsoft YaHei" w:eastAsia="Microsoft YaHei"/>
+          <w:i/>
+          <w:sz w:val="21"/>
+        </w:rPr>
+        <w:t xml:space="preserve">整体设计说明》见 </w:t>
+      </w:r>
+      <w:r>
+        <w:rPr>
+          <w:rFonts w:ascii="Consolas" w:hAnsi="Consolas" w:eastAsia="Microsoft YaHei"/>
+          <w:i/>
+          <w:sz w:val="20"/>
+        </w:rPr>
+        <w:t>docs/competitions/huawei-ict-track3-agent-design.md</w:t>
+      </w:r>
+    </w:p>
+    <w:p>
+      <w:pPr>
+        <w:spacing w:before="60" w:after="140"/>
+        <w:ind w:left="317" w:right="259"/>
+      </w:pPr>
+      <w:r>
+        <w:rPr>
+          <w:rFonts w:ascii="Microsoft YaHei" w:hAnsi="Microsoft YaHei" w:eastAsia="Microsoft YaHei"/>
+          <w:i/>
+          <w:sz w:val="21"/>
+        </w:rPr>
+        <w:t>（Word：</w:t>
+      </w:r>
+      <w:r>
+        <w:rPr>
+          <w:rFonts w:ascii="Consolas" w:hAnsi="Consolas" w:eastAsia="Microsoft YaHei"/>
+          <w:i/>
+          <w:sz w:val="20"/>
+        </w:rPr>
+        <w:t>项目文档/华为ICT赛道三_Nexent智能体设计说明.docx</w:t>
+      </w:r>
+      <w:r>
+        <w:rPr>
+          <w:rFonts w:ascii="Microsoft YaHei" w:hAnsi="Microsoft YaHei" w:eastAsia="Microsoft YaHei"/>
+          <w:i/>
+          <w:sz w:val="21"/>
+        </w:rPr>
+        <w:t>）。</w:t>
       </w:r>
     </w:p>
     <w:p>
@@ -12671,7 +12737,7 @@
                 <w:color w:val="000000"/>
                 <w:sz w:val="17"/>
               </w:rPr>
-              <w:t xml:space="preserve">登记 R-NX-07 </w:t>
+              <w:t>第四章增加与【材料 2】《Nexent 智能体整体设计说明》的交叉引用（</w:t>
             </w:r>
             <w:r>
               <w:rPr>
@@ -12679,7 +12745,7 @@
                 <w:color w:val="000000"/>
                 <w:sz w:val="16"/>
               </w:rPr>
-              <w:t>blocked</w:t>
+              <w:t>docs/competitions/huawei-ict-track3-agent-design.md</w:t>
             </w:r>
             <w:r>
               <w:rPr>
@@ -12687,23 +12753,7 @@
                 <w:color w:val="000000"/>
                 <w:sz w:val="17"/>
               </w:rPr>
-              <w:t xml:space="preserve">：华为托管平台私网环境/网关已建，Target 因账号欠费原生 disabled（0/10），Agent 启用 VPC 报 </w:t>
-            </w:r>
-            <w:r>
-              <w:rPr>
-                <w:rFonts w:ascii="Consolas" w:hAnsi="Consolas" w:eastAsia="Microsoft YaHei"/>
-                <w:color w:val="000000"/>
-                <w:sz w:val="16"/>
-              </w:rPr>
-              <w:t>AgentArts.03002206</w:t>
-            </w:r>
-            <w:r>
-              <w:rPr>
-                <w:rFonts w:ascii="Microsoft YaHei" w:hAnsi="Microsoft YaHei" w:eastAsia="Microsoft YaHei"/>
-                <w:color w:val="000000"/>
-                <w:sz w:val="17"/>
-              </w:rPr>
-              <w:t>；新增充值后 runbook（R-NX-08 准备）</w:t>
+              <w:t>），消除封面重复版本行，升版 1.4</w:t>
             </w:r>
           </w:p>
         </w:tc>
@@ -12729,7 +12779,7 @@
           <w:p>
             <w:pPr>
               <w:spacing w:after="0" w:line="252" w:lineRule="auto"/>
-              <w:jc w:val="left"/>
+              <w:jc w:val="center"/>
             </w:pPr>
             <w:r>
               <w:rPr>
@@ -12737,7 +12787,7 @@
                 <w:color w:val="000000"/>
                 <w:sz w:val="17"/>
               </w:rPr>
-              <w:t>liyongxiang + WP-15</w:t>
+              <w:t>WP-15</w:t>
             </w:r>
           </w:p>
         </w:tc>
@@ -12800,6 +12850,146 @@
               <w:insideV w:val="single" w:sz="6" w:space="0" w:color="D9D9D9"/>
             </w:tcBorders>
             <w:shd w:fill="F3F7FA"/>
+          </w:tcPr>
+          <w:p>
+            <w:pPr>
+              <w:spacing w:after="0" w:line="252" w:lineRule="auto"/>
+              <w:jc w:val="left"/>
+            </w:pPr>
+            <w:r>
+              <w:rPr>
+                <w:rFonts w:ascii="Microsoft YaHei" w:hAnsi="Microsoft YaHei" w:eastAsia="Microsoft YaHei"/>
+                <w:color w:val="000000"/>
+                <w:sz w:val="17"/>
+              </w:rPr>
+              <w:t xml:space="preserve">登记 R-NX-07 </w:t>
+            </w:r>
+            <w:r>
+              <w:rPr>
+                <w:rFonts w:ascii="Consolas" w:hAnsi="Consolas" w:eastAsia="Microsoft YaHei"/>
+                <w:color w:val="000000"/>
+                <w:sz w:val="16"/>
+              </w:rPr>
+              <w:t>blocked</w:t>
+            </w:r>
+            <w:r>
+              <w:rPr>
+                <w:rFonts w:ascii="Microsoft YaHei" w:hAnsi="Microsoft YaHei" w:eastAsia="Microsoft YaHei"/>
+                <w:color w:val="000000"/>
+                <w:sz w:val="17"/>
+              </w:rPr>
+              <w:t xml:space="preserve">：华为托管平台私网环境/网关已建，Target 因账号欠费原生 disabled（0/10），Agent 启用 VPC 报 </w:t>
+            </w:r>
+            <w:r>
+              <w:rPr>
+                <w:rFonts w:ascii="Consolas" w:hAnsi="Consolas" w:eastAsia="Microsoft YaHei"/>
+                <w:color w:val="000000"/>
+                <w:sz w:val="16"/>
+              </w:rPr>
+              <w:t>AgentArts.03002206</w:t>
+            </w:r>
+            <w:r>
+              <w:rPr>
+                <w:rFonts w:ascii="Microsoft YaHei" w:hAnsi="Microsoft YaHei" w:eastAsia="Microsoft YaHei"/>
+                <w:color w:val="000000"/>
+                <w:sz w:val="17"/>
+              </w:rPr>
+              <w:t>；新增充值后 runbook（R-NX-08 准备）</w:t>
+            </w:r>
+          </w:p>
+        </w:tc>
+        <w:tc>
+          <w:tcPr>
+            <w:tcW w:type="dxa" w:w="1152"/>
+            <w:vAlign w:val="center"/>
+            <w:tcMar>
+              <w:top w:w="38" w:type="dxa"/>
+              <w:start w:w="70" w:type="dxa"/>
+              <w:bottom w:w="38" w:type="dxa"/>
+              <w:end w:w="70" w:type="dxa"/>
+            </w:tcMar>
+            <w:tcBorders>
+              <w:top w:val="single" w:sz="6" w:space="0" w:color="D9D9D9"/>
+              <w:left w:val="single" w:sz="6" w:space="0" w:color="D9D9D9"/>
+              <w:bottom w:val="single" w:sz="6" w:space="0" w:color="D9D9D9"/>
+              <w:right w:val="single" w:sz="6" w:space="0" w:color="D9D9D9"/>
+              <w:insideH w:val="single" w:sz="6" w:space="0" w:color="D9D9D9"/>
+              <w:insideV w:val="single" w:sz="6" w:space="0" w:color="D9D9D9"/>
+            </w:tcBorders>
+            <w:shd w:fill="F3F7FA"/>
+          </w:tcPr>
+          <w:p>
+            <w:pPr>
+              <w:spacing w:after="0" w:line="252" w:lineRule="auto"/>
+              <w:jc w:val="left"/>
+            </w:pPr>
+            <w:r>
+              <w:rPr>
+                <w:rFonts w:ascii="Microsoft YaHei" w:hAnsi="Microsoft YaHei" w:eastAsia="Microsoft YaHei"/>
+                <w:color w:val="000000"/>
+                <w:sz w:val="17"/>
+              </w:rPr>
+              <w:t>liyongxiang + WP-15</w:t>
+            </w:r>
+          </w:p>
+        </w:tc>
+      </w:tr>
+      <w:tr>
+        <w:trPr>
+          <w:cantSplit w:val="true"/>
+        </w:trPr>
+        <w:tc>
+          <w:tcPr>
+            <w:tcW w:type="dxa" w:w="1753"/>
+            <w:vAlign w:val="center"/>
+            <w:tcMar>
+              <w:top w:w="38" w:type="dxa"/>
+              <w:start w:w="70" w:type="dxa"/>
+              <w:bottom w:w="38" w:type="dxa"/>
+              <w:end w:w="70" w:type="dxa"/>
+            </w:tcMar>
+            <w:tcBorders>
+              <w:top w:val="single" w:sz="6" w:space="0" w:color="D9D9D9"/>
+              <w:left w:val="single" w:sz="6" w:space="0" w:color="D9D9D9"/>
+              <w:bottom w:val="single" w:sz="6" w:space="0" w:color="D9D9D9"/>
+              <w:right w:val="single" w:sz="6" w:space="0" w:color="D9D9D9"/>
+              <w:insideH w:val="single" w:sz="6" w:space="0" w:color="D9D9D9"/>
+              <w:insideV w:val="single" w:sz="6" w:space="0" w:color="D9D9D9"/>
+            </w:tcBorders>
+          </w:tcPr>
+          <w:p>
+            <w:pPr>
+              <w:spacing w:after="0" w:line="252" w:lineRule="auto"/>
+              <w:jc w:val="left"/>
+            </w:pPr>
+            <w:r>
+              <w:rPr>
+                <w:rFonts w:ascii="Microsoft YaHei" w:hAnsi="Microsoft YaHei" w:eastAsia="Microsoft YaHei"/>
+                <w:color w:val="000000"/>
+                <w:sz w:val="17"/>
+              </w:rPr>
+              <w:t>2026-09-30</w:t>
+            </w:r>
+          </w:p>
+        </w:tc>
+        <w:tc>
+          <w:tcPr>
+            <w:tcW w:type="dxa" w:w="7088"/>
+            <w:vAlign w:val="center"/>
+            <w:tcMar>
+              <w:top w:w="38" w:type="dxa"/>
+              <w:start w:w="70" w:type="dxa"/>
+              <w:bottom w:w="38" w:type="dxa"/>
+              <w:end w:w="70" w:type="dxa"/>
+            </w:tcMar>
+            <w:tcBorders>
+              <w:top w:val="single" w:sz="6" w:space="0" w:color="D9D9D9"/>
+              <w:left w:val="single" w:sz="6" w:space="0" w:color="D9D9D9"/>
+              <w:bottom w:val="single" w:sz="6" w:space="0" w:color="D9D9D9"/>
+              <w:right w:val="single" w:sz="6" w:space="0" w:color="D9D9D9"/>
+              <w:insideH w:val="single" w:sz="6" w:space="0" w:color="D9D9D9"/>
+              <w:insideV w:val="single" w:sz="6" w:space="0" w:color="D9D9D9"/>
+            </w:tcBorders>
           </w:tcPr>
           <w:p>
             <w:pPr>
@@ -12875,7 +13065,6 @@
               <w:insideH w:val="single" w:sz="6" w:space="0" w:color="D9D9D9"/>
               <w:insideV w:val="single" w:sz="6" w:space="0" w:color="D9D9D9"/>
             </w:tcBorders>
-            <w:shd w:fill="F3F7FA"/>
           </w:tcPr>
           <w:p>
             <w:pPr>

</xml_diff>